<commit_message>
docs: User cases & stories
</commit_message>
<xml_diff>
--- a/docs/LifeDuo - Documentação de Projeto.docx
+++ b/docs/LifeDuo - Documentação de Projeto.docx
@@ -1193,6 +1193,9 @@
             <w:pPr>
               <w:spacing w:before="40" w:after="40"/>
             </w:pPr>
+            <w:r>
+              <w:t>Kayke Emanoel de Souza Santos</w:t>
+            </w:r>
           </w:p>
         </w:tc>
         <w:tc>
@@ -1206,6 +1209,9 @@
             <w:pPr>
               <w:spacing w:before="40" w:after="40"/>
             </w:pPr>
+            <w:r>
+              <w:t>19/05/2026</w:t>
+            </w:r>
           </w:p>
         </w:tc>
         <w:tc>
@@ -1219,6 +1225,19 @@
             <w:pPr>
               <w:spacing w:before="40" w:after="40"/>
             </w:pPr>
+            <w:proofErr w:type="spellStart"/>
+            <w:r>
+              <w:t>Documento</w:t>
+            </w:r>
+            <w:proofErr w:type="spellEnd"/>
+            <w:r>
+              <w:t xml:space="preserve"> </w:t>
+            </w:r>
+            <w:proofErr w:type="spellStart"/>
+            <w:r>
+              <w:t>iniciado</w:t>
+            </w:r>
+            <w:proofErr w:type="spellEnd"/>
           </w:p>
         </w:tc>
         <w:tc>
@@ -1232,6 +1251,9 @@
             <w:pPr>
               <w:spacing w:before="40" w:after="40"/>
             </w:pPr>
+            <w:r>
+              <w:t>1.0.0</w:t>
+            </w:r>
           </w:p>
         </w:tc>
       </w:tr>
@@ -1325,6 +1347,8 @@
       <w:pPr>
         <w:jc w:val="both"/>
       </w:pPr>
+      <w:bookmarkStart w:id="4" w:name="_1fob9te" w:colFirst="0" w:colLast="0"/>
+      <w:bookmarkEnd w:id="4"/>
       <w:r>
         <w:t xml:space="preserve">Este </w:t>
       </w:r>
@@ -1338,23 +1362,31 @@
       </w:r>
       <w:proofErr w:type="spellStart"/>
       <w:r>
-        <w:t>agrega</w:t>
-      </w:r>
-      <w:proofErr w:type="spellEnd"/>
-      <w:r>
-        <w:t xml:space="preserve">: 1) </w:t>
-      </w:r>
-      <w:proofErr w:type="gramStart"/>
-      <w:r>
-        <w:t>a</w:t>
-      </w:r>
-      <w:proofErr w:type="gramEnd"/>
-      <w:r>
-        <w:t xml:space="preserve"> </w:t>
-      </w:r>
-      <w:proofErr w:type="spellStart"/>
-      <w:r>
-        <w:t>elaboração</w:t>
+        <w:t>aborda</w:t>
+      </w:r>
+      <w:proofErr w:type="spellEnd"/>
+      <w:r>
+        <w:t xml:space="preserve"> </w:t>
+      </w:r>
+      <w:proofErr w:type="spellStart"/>
+      <w:r>
+        <w:t>os</w:t>
+      </w:r>
+      <w:proofErr w:type="spellEnd"/>
+      <w:r>
+        <w:t xml:space="preserve"> </w:t>
+      </w:r>
+      <w:proofErr w:type="spellStart"/>
+      <w:r>
+        <w:t>modelos</w:t>
+      </w:r>
+      <w:proofErr w:type="spellEnd"/>
+      <w:r>
+        <w:t xml:space="preserve"> de </w:t>
+      </w:r>
+      <w:proofErr w:type="spellStart"/>
+      <w:r>
+        <w:t>usuário</w:t>
       </w:r>
       <w:proofErr w:type="spellEnd"/>
       <w:r>
@@ -1362,7 +1394,207 @@
       </w:r>
       <w:proofErr w:type="spellStart"/>
       <w:r>
-        <w:t>revisão</w:t>
+        <w:t>requisitos</w:t>
+      </w:r>
+      <w:proofErr w:type="spellEnd"/>
+      <w:r>
+        <w:t xml:space="preserve"> do </w:t>
+      </w:r>
+      <w:proofErr w:type="spellStart"/>
+      <w:r>
+        <w:t>sistema</w:t>
+      </w:r>
+      <w:proofErr w:type="spellEnd"/>
+      <w:r>
+        <w:t xml:space="preserve"> </w:t>
+      </w:r>
+      <w:proofErr w:type="spellStart"/>
+      <w:r>
+        <w:t>LifeDuo</w:t>
+      </w:r>
+      <w:proofErr w:type="spellEnd"/>
+      <w:r>
+        <w:t xml:space="preserve">, um </w:t>
+      </w:r>
+      <w:proofErr w:type="spellStart"/>
+      <w:r>
+        <w:t>aplicativo</w:t>
+      </w:r>
+      <w:proofErr w:type="spellEnd"/>
+      <w:r>
+        <w:t xml:space="preserve"> mobile </w:t>
+      </w:r>
+      <w:proofErr w:type="spellStart"/>
+      <w:r>
+        <w:t>voltado</w:t>
+      </w:r>
+      <w:proofErr w:type="spellEnd"/>
+      <w:r>
+        <w:t xml:space="preserve"> para </w:t>
+      </w:r>
+      <w:proofErr w:type="spellStart"/>
+      <w:r>
+        <w:t>casais</w:t>
+      </w:r>
+      <w:proofErr w:type="spellEnd"/>
+      <w:r>
+        <w:t xml:space="preserve">. São </w:t>
+      </w:r>
+      <w:proofErr w:type="spellStart"/>
+      <w:r>
+        <w:t>descritos</w:t>
+      </w:r>
+      <w:proofErr w:type="spellEnd"/>
+      <w:r>
+        <w:t xml:space="preserve"> </w:t>
+      </w:r>
+      <w:proofErr w:type="spellStart"/>
+      <w:r>
+        <w:t>os</w:t>
+      </w:r>
+      <w:proofErr w:type="spellEnd"/>
+      <w:r>
+        <w:t xml:space="preserve"> </w:t>
+      </w:r>
+      <w:proofErr w:type="spellStart"/>
+      <w:r>
+        <w:t>atores</w:t>
+      </w:r>
+      <w:proofErr w:type="spellEnd"/>
+      <w:r>
+        <w:t xml:space="preserve"> </w:t>
+      </w:r>
+      <w:proofErr w:type="spellStart"/>
+      <w:r>
+        <w:t>envolvidos</w:t>
+      </w:r>
+      <w:proofErr w:type="spellEnd"/>
+      <w:r>
+        <w:t xml:space="preserve"> no </w:t>
+      </w:r>
+      <w:proofErr w:type="spellStart"/>
+      <w:r>
+        <w:t>sistema</w:t>
+      </w:r>
+      <w:proofErr w:type="spellEnd"/>
+      <w:r>
+        <w:t xml:space="preserve"> — </w:t>
+      </w:r>
+      <w:proofErr w:type="spellStart"/>
+      <w:r>
+        <w:t>os</w:t>
+      </w:r>
+      <w:proofErr w:type="spellEnd"/>
+      <w:r>
+        <w:t xml:space="preserve"> </w:t>
+      </w:r>
+      <w:proofErr w:type="spellStart"/>
+      <w:r>
+        <w:t>parceiros</w:t>
+      </w:r>
+      <w:proofErr w:type="spellEnd"/>
+      <w:r>
+        <w:t xml:space="preserve"> </w:t>
+      </w:r>
+      <w:proofErr w:type="spellStart"/>
+      <w:r>
+        <w:t>como</w:t>
+      </w:r>
+      <w:proofErr w:type="spellEnd"/>
+      <w:r>
+        <w:t xml:space="preserve"> </w:t>
+      </w:r>
+      <w:proofErr w:type="spellStart"/>
+      <w:r>
+        <w:t>usuários</w:t>
+      </w:r>
+      <w:proofErr w:type="spellEnd"/>
+      <w:r>
+        <w:t xml:space="preserve"> </w:t>
+      </w:r>
+      <w:proofErr w:type="spellStart"/>
+      <w:r>
+        <w:t>principais</w:t>
+      </w:r>
+      <w:proofErr w:type="spellEnd"/>
+      <w:r>
+        <w:t xml:space="preserve">, o </w:t>
+      </w:r>
+      <w:proofErr w:type="spellStart"/>
+      <w:r>
+        <w:t>administrador</w:t>
+      </w:r>
+      <w:proofErr w:type="spellEnd"/>
+      <w:r>
+        <w:t xml:space="preserve"> da </w:t>
+      </w:r>
+      <w:proofErr w:type="spellStart"/>
+      <w:r>
+        <w:t>plataforma</w:t>
+      </w:r>
+      <w:proofErr w:type="spellEnd"/>
+      <w:r>
+        <w:t xml:space="preserve"> e </w:t>
+      </w:r>
+      <w:proofErr w:type="spellStart"/>
+      <w:r>
+        <w:t>os</w:t>
+      </w:r>
+      <w:proofErr w:type="spellEnd"/>
+      <w:r>
+        <w:t xml:space="preserve"> </w:t>
+      </w:r>
+      <w:proofErr w:type="spellStart"/>
+      <w:r>
+        <w:t>serviços</w:t>
+      </w:r>
+      <w:proofErr w:type="spellEnd"/>
+      <w:r>
+        <w:t xml:space="preserve"> </w:t>
+      </w:r>
+      <w:proofErr w:type="spellStart"/>
+      <w:r>
+        <w:t>externos</w:t>
+      </w:r>
+      <w:proofErr w:type="spellEnd"/>
+      <w:r>
+        <w:t xml:space="preserve"> </w:t>
+      </w:r>
+      <w:proofErr w:type="spellStart"/>
+      <w:r>
+        <w:t>integrados</w:t>
+      </w:r>
+      <w:proofErr w:type="spellEnd"/>
+      <w:r>
+        <w:t xml:space="preserve"> — </w:t>
+      </w:r>
+      <w:proofErr w:type="spellStart"/>
+      <w:r>
+        <w:t>bem</w:t>
+      </w:r>
+      <w:proofErr w:type="spellEnd"/>
+      <w:r>
+        <w:t xml:space="preserve"> </w:t>
+      </w:r>
+      <w:proofErr w:type="spellStart"/>
+      <w:r>
+        <w:t>como</w:t>
+      </w:r>
+      <w:proofErr w:type="spellEnd"/>
+      <w:r>
+        <w:t xml:space="preserve"> </w:t>
+      </w:r>
+      <w:proofErr w:type="spellStart"/>
+      <w:r>
+        <w:t>os</w:t>
+      </w:r>
+      <w:proofErr w:type="spellEnd"/>
+      <w:r>
+        <w:t xml:space="preserve"> </w:t>
+      </w:r>
+      <w:proofErr w:type="spellStart"/>
+      <w:r>
+        <w:t>casos</w:t>
       </w:r>
       <w:proofErr w:type="spellEnd"/>
       <w:r>
@@ -1370,7 +1602,71 @@
       </w:r>
       <w:proofErr w:type="spellStart"/>
       <w:r>
-        <w:t>modelos</w:t>
+        <w:t>uso</w:t>
+      </w:r>
+      <w:proofErr w:type="spellEnd"/>
+      <w:r>
+        <w:t xml:space="preserve"> que </w:t>
+      </w:r>
+      <w:proofErr w:type="spellStart"/>
+      <w:r>
+        <w:t>representam</w:t>
+      </w:r>
+      <w:proofErr w:type="spellEnd"/>
+      <w:r>
+        <w:t xml:space="preserve"> </w:t>
+      </w:r>
+      <w:proofErr w:type="spellStart"/>
+      <w:r>
+        <w:t>todas</w:t>
+      </w:r>
+      <w:proofErr w:type="spellEnd"/>
+      <w:r>
+        <w:t xml:space="preserve"> as </w:t>
+      </w:r>
+      <w:proofErr w:type="spellStart"/>
+      <w:r>
+        <w:t>interações</w:t>
+      </w:r>
+      <w:proofErr w:type="spellEnd"/>
+      <w:r>
+        <w:t xml:space="preserve"> </w:t>
+      </w:r>
+      <w:proofErr w:type="spellStart"/>
+      <w:r>
+        <w:t>possíveis</w:t>
+      </w:r>
+      <w:proofErr w:type="spellEnd"/>
+      <w:r>
+        <w:t xml:space="preserve"> entre esses </w:t>
+      </w:r>
+      <w:proofErr w:type="spellStart"/>
+      <w:r>
+        <w:t>atores</w:t>
+      </w:r>
+      <w:proofErr w:type="spellEnd"/>
+      <w:r>
+        <w:t xml:space="preserve"> e o app, </w:t>
+      </w:r>
+      <w:proofErr w:type="spellStart"/>
+      <w:r>
+        <w:t>acompanhados</w:t>
+      </w:r>
+      <w:proofErr w:type="spellEnd"/>
+      <w:r>
+        <w:t xml:space="preserve"> das </w:t>
+      </w:r>
+      <w:proofErr w:type="spellStart"/>
+      <w:r>
+        <w:t>respectivas</w:t>
+      </w:r>
+      <w:proofErr w:type="spellEnd"/>
+      <w:r>
+        <w:t xml:space="preserve"> </w:t>
+      </w:r>
+      <w:proofErr w:type="spellStart"/>
+      <w:r>
+        <w:t>histórias</w:t>
       </w:r>
       <w:proofErr w:type="spellEnd"/>
       <w:r>
@@ -1378,15 +1674,31 @@
       </w:r>
       <w:proofErr w:type="spellStart"/>
       <w:r>
-        <w:t>domínio</w:t>
-      </w:r>
-      <w:proofErr w:type="spellEnd"/>
-      <w:r>
-        <w:t xml:space="preserve"> e 2) </w:t>
-      </w:r>
-      <w:proofErr w:type="spellStart"/>
-      <w:r>
-        <w:t>modelos</w:t>
+        <w:t>usuário</w:t>
+      </w:r>
+      <w:proofErr w:type="spellEnd"/>
+      <w:r>
+        <w:t xml:space="preserve"> que </w:t>
+      </w:r>
+      <w:proofErr w:type="spellStart"/>
+      <w:r>
+        <w:t>expressam</w:t>
+      </w:r>
+      <w:proofErr w:type="spellEnd"/>
+      <w:r>
+        <w:t xml:space="preserve"> as </w:t>
+      </w:r>
+      <w:proofErr w:type="spellStart"/>
+      <w:r>
+        <w:t>necessidades</w:t>
+      </w:r>
+      <w:proofErr w:type="spellEnd"/>
+      <w:r>
+        <w:t xml:space="preserve"> e </w:t>
+      </w:r>
+      <w:proofErr w:type="spellStart"/>
+      <w:r>
+        <w:t>expectativas</w:t>
       </w:r>
       <w:proofErr w:type="spellEnd"/>
       <w:r>
@@ -1394,11 +1706,19 @@
       </w:r>
       <w:proofErr w:type="spellStart"/>
       <w:r>
-        <w:t>projeto</w:t>
-      </w:r>
-      <w:proofErr w:type="spellEnd"/>
-      <w:r>
-        <w:t xml:space="preserve"> para o </w:t>
+        <w:t>quem</w:t>
+      </w:r>
+      <w:proofErr w:type="spellEnd"/>
+      <w:r>
+        <w:t xml:space="preserve"> </w:t>
+      </w:r>
+      <w:proofErr w:type="spellStart"/>
+      <w:r>
+        <w:t>utiliza</w:t>
+      </w:r>
+      <w:proofErr w:type="spellEnd"/>
+      <w:r>
+        <w:t xml:space="preserve"> o </w:t>
       </w:r>
       <w:proofErr w:type="spellStart"/>
       <w:r>
@@ -1406,122 +1726,7 @@
       </w:r>
       <w:proofErr w:type="spellEnd"/>
       <w:r>
-        <w:t xml:space="preserve"> &lt;</w:t>
-      </w:r>
-      <w:proofErr w:type="spellStart"/>
-      <w:r>
-        <w:rPr>
-          <w:color w:val="FF0000"/>
-        </w:rPr>
-        <w:t>LifeDuo</w:t>
-      </w:r>
-      <w:proofErr w:type="spellEnd"/>
-      <w:r>
-        <w:t xml:space="preserve">&gt;. A </w:t>
-      </w:r>
-      <w:proofErr w:type="spellStart"/>
-      <w:r>
-        <w:t>referência</w:t>
-      </w:r>
-      <w:proofErr w:type="spellEnd"/>
-      <w:r>
-        <w:t xml:space="preserve"> principal para a </w:t>
-      </w:r>
-      <w:proofErr w:type="spellStart"/>
-      <w:r>
-        <w:t>descrição</w:t>
-      </w:r>
-      <w:proofErr w:type="spellEnd"/>
-      <w:r>
-        <w:t xml:space="preserve"> </w:t>
-      </w:r>
-      <w:proofErr w:type="spellStart"/>
-      <w:r>
-        <w:t>geral</w:t>
-      </w:r>
-      <w:proofErr w:type="spellEnd"/>
-      <w:r>
-        <w:t xml:space="preserve"> do </w:t>
-      </w:r>
-      <w:proofErr w:type="spellStart"/>
-      <w:r>
-        <w:t>problema</w:t>
-      </w:r>
-      <w:proofErr w:type="spellEnd"/>
-      <w:r>
-        <w:t xml:space="preserve">, </w:t>
-      </w:r>
-      <w:proofErr w:type="spellStart"/>
-      <w:r>
-        <w:t>domínio</w:t>
-      </w:r>
-      <w:proofErr w:type="spellEnd"/>
-      <w:r>
-        <w:t xml:space="preserve"> e </w:t>
-      </w:r>
-      <w:proofErr w:type="spellStart"/>
-      <w:r>
-        <w:t>requisitos</w:t>
-      </w:r>
-      <w:proofErr w:type="spellEnd"/>
-      <w:r>
-        <w:t xml:space="preserve"> do </w:t>
-      </w:r>
-      <w:proofErr w:type="spellStart"/>
-      <w:r>
-        <w:t>sistema</w:t>
-      </w:r>
-      <w:proofErr w:type="spellEnd"/>
-      <w:r>
-        <w:t xml:space="preserve"> é o </w:t>
-      </w:r>
-      <w:proofErr w:type="spellStart"/>
-      <w:r>
-        <w:t>documento</w:t>
-      </w:r>
-      <w:proofErr w:type="spellEnd"/>
-      <w:r>
-        <w:t xml:space="preserve"> de </w:t>
-      </w:r>
-      <w:proofErr w:type="spellStart"/>
-      <w:r>
-        <w:t>especificação</w:t>
-      </w:r>
-      <w:proofErr w:type="spellEnd"/>
-      <w:r>
-        <w:t xml:space="preserve"> que </w:t>
-      </w:r>
-      <w:proofErr w:type="spellStart"/>
-      <w:r>
-        <w:t>descreve</w:t>
-      </w:r>
-      <w:proofErr w:type="spellEnd"/>
-      <w:r>
-        <w:t xml:space="preserve"> a </w:t>
-      </w:r>
-      <w:proofErr w:type="spellStart"/>
-      <w:r>
-        <w:t>visão</w:t>
-      </w:r>
-      <w:proofErr w:type="spellEnd"/>
-      <w:r>
-        <w:t xml:space="preserve"> de </w:t>
-      </w:r>
-      <w:proofErr w:type="spellStart"/>
-      <w:r>
-        <w:t>domínio</w:t>
-      </w:r>
-      <w:proofErr w:type="spellEnd"/>
-      <w:r>
-        <w:t xml:space="preserve"> do </w:t>
-      </w:r>
-      <w:proofErr w:type="spellStart"/>
-      <w:r>
-        <w:t>sistema</w:t>
-      </w:r>
-      <w:proofErr w:type="spellEnd"/>
-      <w:r>
-        <w:t xml:space="preserve">. </w:t>
+        <w:t>.</w:t>
       </w:r>
     </w:p>
     <w:p>
@@ -1532,8 +1737,6 @@
           <w:numId w:val="1"/>
         </w:numPr>
       </w:pPr>
-      <w:bookmarkStart w:id="4" w:name="_1fob9te" w:colFirst="0" w:colLast="0"/>
-      <w:bookmarkEnd w:id="4"/>
       <w:proofErr w:type="spellStart"/>
       <w:r>
         <w:t>Modelos</w:t>
@@ -1584,28 +1787,633 @@
       <w:pPr>
         <w:jc w:val="both"/>
       </w:pPr>
-      <w:r>
-        <w:t xml:space="preserve">Nesta </w:t>
-      </w:r>
-      <w:proofErr w:type="spellStart"/>
-      <w:r>
-        <w:t>subseção</w:t>
-      </w:r>
-      <w:proofErr w:type="spellEnd"/>
-      <w:r>
-        <w:t xml:space="preserve"> é </w:t>
-      </w:r>
-      <w:proofErr w:type="spellStart"/>
-      <w:r>
-        <w:t>apresentado</w:t>
-      </w:r>
-      <w:proofErr w:type="spellEnd"/>
-      <w:r>
-        <w:t xml:space="preserve"> </w:t>
-      </w:r>
-      <w:proofErr w:type="spellStart"/>
-      <w:r>
-        <w:t>descrição</w:t>
+      <w:proofErr w:type="spellStart"/>
+      <w:r>
+        <w:rPr>
+          <w:b/>
+          <w:bCs/>
+        </w:rPr>
+        <w:t>Parceiro</w:t>
+      </w:r>
+      <w:proofErr w:type="spellEnd"/>
+      <w:r>
+        <w:rPr>
+          <w:b/>
+          <w:bCs/>
+        </w:rPr>
+        <w:t xml:space="preserve"> A</w:t>
+      </w:r>
+      <w:r>
+        <w:t xml:space="preserve"> e </w:t>
+      </w:r>
+      <w:proofErr w:type="spellStart"/>
+      <w:r>
+        <w:rPr>
+          <w:b/>
+          <w:bCs/>
+        </w:rPr>
+        <w:t>Parceiro</w:t>
+      </w:r>
+      <w:proofErr w:type="spellEnd"/>
+      <w:r>
+        <w:rPr>
+          <w:b/>
+          <w:bCs/>
+        </w:rPr>
+        <w:t xml:space="preserve"> B</w:t>
+      </w:r>
+      <w:r>
+        <w:t xml:space="preserve"> </w:t>
+      </w:r>
+      <w:proofErr w:type="spellStart"/>
+      <w:r>
+        <w:t>são</w:t>
+      </w:r>
+      <w:proofErr w:type="spellEnd"/>
+      <w:r>
+        <w:t xml:space="preserve"> </w:t>
+      </w:r>
+      <w:proofErr w:type="spellStart"/>
+      <w:r>
+        <w:t>os</w:t>
+      </w:r>
+      <w:proofErr w:type="spellEnd"/>
+      <w:r>
+        <w:t xml:space="preserve"> </w:t>
+      </w:r>
+      <w:proofErr w:type="spellStart"/>
+      <w:r>
+        <w:t>usuários</w:t>
+      </w:r>
+      <w:proofErr w:type="spellEnd"/>
+      <w:r>
+        <w:t xml:space="preserve"> </w:t>
+      </w:r>
+      <w:proofErr w:type="spellStart"/>
+      <w:r>
+        <w:t>principais</w:t>
+      </w:r>
+      <w:proofErr w:type="spellEnd"/>
+      <w:r>
+        <w:t xml:space="preserve"> do app. </w:t>
+      </w:r>
+      <w:proofErr w:type="spellStart"/>
+      <w:r>
+        <w:t>Representam</w:t>
+      </w:r>
+      <w:proofErr w:type="spellEnd"/>
+      <w:r>
+        <w:t xml:space="preserve"> as duas </w:t>
+      </w:r>
+      <w:proofErr w:type="spellStart"/>
+      <w:r>
+        <w:t>pessoas</w:t>
+      </w:r>
+      <w:proofErr w:type="spellEnd"/>
+      <w:r>
+        <w:t xml:space="preserve"> do </w:t>
+      </w:r>
+      <w:proofErr w:type="spellStart"/>
+      <w:r>
+        <w:t>casal</w:t>
+      </w:r>
+      <w:proofErr w:type="spellEnd"/>
+      <w:r>
+        <w:t xml:space="preserve"> </w:t>
+      </w:r>
+      <w:proofErr w:type="spellStart"/>
+      <w:r>
+        <w:t>vinculado</w:t>
+      </w:r>
+      <w:proofErr w:type="spellEnd"/>
+      <w:r>
+        <w:t xml:space="preserve"> e </w:t>
+      </w:r>
+      <w:proofErr w:type="spellStart"/>
+      <w:r>
+        <w:t>possuem</w:t>
+      </w:r>
+      <w:proofErr w:type="spellEnd"/>
+      <w:r>
+        <w:t xml:space="preserve"> </w:t>
+      </w:r>
+      <w:proofErr w:type="spellStart"/>
+      <w:r>
+        <w:t>papéis</w:t>
+      </w:r>
+      <w:proofErr w:type="spellEnd"/>
+      <w:r>
+        <w:t xml:space="preserve"> </w:t>
+      </w:r>
+      <w:proofErr w:type="spellStart"/>
+      <w:r>
+        <w:t>simétricos</w:t>
+      </w:r>
+      <w:proofErr w:type="spellEnd"/>
+      <w:r>
+        <w:t xml:space="preserve">, </w:t>
+      </w:r>
+      <w:proofErr w:type="spellStart"/>
+      <w:r>
+        <w:t>ou</w:t>
+      </w:r>
+      <w:proofErr w:type="spellEnd"/>
+      <w:r>
+        <w:t xml:space="preserve"> </w:t>
+      </w:r>
+      <w:proofErr w:type="spellStart"/>
+      <w:r>
+        <w:t>seja</w:t>
+      </w:r>
+      <w:proofErr w:type="spellEnd"/>
+      <w:r>
+        <w:t xml:space="preserve">, </w:t>
+      </w:r>
+      <w:proofErr w:type="spellStart"/>
+      <w:r>
+        <w:t>qualquer</w:t>
+      </w:r>
+      <w:proofErr w:type="spellEnd"/>
+      <w:r>
+        <w:t xml:space="preserve"> um dos </w:t>
+      </w:r>
+      <w:proofErr w:type="spellStart"/>
+      <w:r>
+        <w:t>dois</w:t>
+      </w:r>
+      <w:proofErr w:type="spellEnd"/>
+      <w:r>
+        <w:t xml:space="preserve"> </w:t>
+      </w:r>
+      <w:proofErr w:type="spellStart"/>
+      <w:r>
+        <w:t>pode</w:t>
+      </w:r>
+      <w:proofErr w:type="spellEnd"/>
+      <w:r>
+        <w:t xml:space="preserve"> </w:t>
+      </w:r>
+      <w:proofErr w:type="spellStart"/>
+      <w:r>
+        <w:t>iniciar</w:t>
+      </w:r>
+      <w:proofErr w:type="spellEnd"/>
+      <w:r>
+        <w:t xml:space="preserve"> </w:t>
+      </w:r>
+      <w:proofErr w:type="spellStart"/>
+      <w:r>
+        <w:t>qualquer</w:t>
+      </w:r>
+      <w:proofErr w:type="spellEnd"/>
+      <w:r>
+        <w:t xml:space="preserve"> </w:t>
+      </w:r>
+      <w:proofErr w:type="spellStart"/>
+      <w:r>
+        <w:t>ação</w:t>
+      </w:r>
+      <w:proofErr w:type="spellEnd"/>
+      <w:r>
+        <w:t xml:space="preserve"> </w:t>
+      </w:r>
+      <w:proofErr w:type="spellStart"/>
+      <w:r>
+        <w:t>disponível</w:t>
+      </w:r>
+      <w:proofErr w:type="spellEnd"/>
+      <w:r>
+        <w:t xml:space="preserve"> no </w:t>
+      </w:r>
+      <w:proofErr w:type="spellStart"/>
+      <w:r>
+        <w:t>sistema</w:t>
+      </w:r>
+      <w:proofErr w:type="spellEnd"/>
+      <w:r>
+        <w:t xml:space="preserve">, </w:t>
+      </w:r>
+      <w:proofErr w:type="spellStart"/>
+      <w:r>
+        <w:t>como</w:t>
+      </w:r>
+      <w:proofErr w:type="spellEnd"/>
+      <w:r>
+        <w:t xml:space="preserve"> </w:t>
+      </w:r>
+      <w:proofErr w:type="spellStart"/>
+      <w:r>
+        <w:t>fazer</w:t>
+      </w:r>
+      <w:proofErr w:type="spellEnd"/>
+      <w:r>
+        <w:t xml:space="preserve"> check-in, </w:t>
+      </w:r>
+      <w:proofErr w:type="spellStart"/>
+      <w:r>
+        <w:t>criar</w:t>
+      </w:r>
+      <w:proofErr w:type="spellEnd"/>
+      <w:r>
+        <w:t xml:space="preserve"> </w:t>
+      </w:r>
+      <w:proofErr w:type="spellStart"/>
+      <w:r>
+        <w:t>metas</w:t>
+      </w:r>
+      <w:proofErr w:type="spellEnd"/>
+      <w:r>
+        <w:t xml:space="preserve">, </w:t>
+      </w:r>
+      <w:proofErr w:type="spellStart"/>
+      <w:r>
+        <w:t>enviar</w:t>
+      </w:r>
+      <w:proofErr w:type="spellEnd"/>
+      <w:r>
+        <w:t xml:space="preserve"> </w:t>
+      </w:r>
+      <w:proofErr w:type="spellStart"/>
+      <w:r>
+        <w:t>presentes</w:t>
+      </w:r>
+      <w:proofErr w:type="spellEnd"/>
+      <w:r>
+        <w:t xml:space="preserve"> e </w:t>
+      </w:r>
+      <w:proofErr w:type="spellStart"/>
+      <w:r>
+        <w:t>interagir</w:t>
+      </w:r>
+      <w:proofErr w:type="spellEnd"/>
+      <w:r>
+        <w:t xml:space="preserve"> com o </w:t>
+      </w:r>
+      <w:proofErr w:type="spellStart"/>
+      <w:r>
+        <w:t>mascote</w:t>
+      </w:r>
+      <w:proofErr w:type="spellEnd"/>
+      <w:r>
+        <w:t xml:space="preserve">. </w:t>
+      </w:r>
+      <w:proofErr w:type="spellStart"/>
+      <w:r>
+        <w:t>Certas</w:t>
+      </w:r>
+      <w:proofErr w:type="spellEnd"/>
+      <w:r>
+        <w:t xml:space="preserve"> </w:t>
+      </w:r>
+      <w:proofErr w:type="spellStart"/>
+      <w:r>
+        <w:t>funcionalidades</w:t>
+      </w:r>
+      <w:proofErr w:type="spellEnd"/>
+      <w:r>
+        <w:t xml:space="preserve">, </w:t>
+      </w:r>
+      <w:proofErr w:type="spellStart"/>
+      <w:r>
+        <w:t>como</w:t>
+      </w:r>
+      <w:proofErr w:type="spellEnd"/>
+      <w:r>
+        <w:t xml:space="preserve"> o streak </w:t>
+      </w:r>
+      <w:proofErr w:type="spellStart"/>
+      <w:r>
+        <w:t>diário</w:t>
+      </w:r>
+      <w:proofErr w:type="spellEnd"/>
+      <w:r>
+        <w:t xml:space="preserve"> e as </w:t>
+      </w:r>
+      <w:proofErr w:type="spellStart"/>
+      <w:r>
+        <w:t>missões</w:t>
+      </w:r>
+      <w:proofErr w:type="spellEnd"/>
+      <w:r>
+        <w:t xml:space="preserve"> </w:t>
+      </w:r>
+      <w:proofErr w:type="spellStart"/>
+      <w:r>
+        <w:t>semanais</w:t>
+      </w:r>
+      <w:proofErr w:type="spellEnd"/>
+      <w:r>
+        <w:t xml:space="preserve">, </w:t>
+      </w:r>
+      <w:proofErr w:type="spellStart"/>
+      <w:r>
+        <w:t>exigem</w:t>
+      </w:r>
+      <w:proofErr w:type="spellEnd"/>
+      <w:r>
+        <w:t xml:space="preserve"> a </w:t>
+      </w:r>
+      <w:proofErr w:type="spellStart"/>
+      <w:r>
+        <w:t>participação</w:t>
+      </w:r>
+      <w:proofErr w:type="spellEnd"/>
+      <w:r>
+        <w:t xml:space="preserve"> dos </w:t>
+      </w:r>
+      <w:proofErr w:type="spellStart"/>
+      <w:r>
+        <w:t>dois</w:t>
+      </w:r>
+      <w:proofErr w:type="spellEnd"/>
+      <w:r>
+        <w:t xml:space="preserve"> para </w:t>
+      </w:r>
+      <w:proofErr w:type="spellStart"/>
+      <w:r>
+        <w:t>serem</w:t>
+      </w:r>
+      <w:proofErr w:type="spellEnd"/>
+      <w:r>
+        <w:t xml:space="preserve"> </w:t>
+      </w:r>
+      <w:proofErr w:type="spellStart"/>
+      <w:r>
+        <w:t>concluídas</w:t>
+      </w:r>
+      <w:proofErr w:type="spellEnd"/>
+      <w:r>
+        <w:t>.</w:t>
+      </w:r>
+    </w:p>
+    <w:p>
+      <w:pPr>
+        <w:jc w:val="both"/>
+      </w:pPr>
+    </w:p>
+    <w:p>
+      <w:pPr>
+        <w:jc w:val="both"/>
+      </w:pPr>
+      <w:proofErr w:type="spellStart"/>
+      <w:r>
+        <w:rPr>
+          <w:b/>
+          <w:bCs/>
+        </w:rPr>
+        <w:t>Administrador</w:t>
+      </w:r>
+      <w:proofErr w:type="spellEnd"/>
+      <w:r>
+        <w:t xml:space="preserve"> é o </w:t>
+      </w:r>
+      <w:proofErr w:type="spellStart"/>
+      <w:r>
+        <w:t>responsável</w:t>
+      </w:r>
+      <w:proofErr w:type="spellEnd"/>
+      <w:r>
+        <w:t xml:space="preserve"> pela </w:t>
+      </w:r>
+      <w:proofErr w:type="spellStart"/>
+      <w:r>
+        <w:t>gestão</w:t>
+      </w:r>
+      <w:proofErr w:type="spellEnd"/>
+      <w:r>
+        <w:t xml:space="preserve"> da </w:t>
+      </w:r>
+      <w:proofErr w:type="spellStart"/>
+      <w:r>
+        <w:t>plataforma</w:t>
+      </w:r>
+      <w:proofErr w:type="spellEnd"/>
+      <w:r>
+        <w:t xml:space="preserve">. </w:t>
+      </w:r>
+      <w:proofErr w:type="spellStart"/>
+      <w:r>
+        <w:t>Configura</w:t>
+      </w:r>
+      <w:proofErr w:type="spellEnd"/>
+      <w:r>
+        <w:t xml:space="preserve"> </w:t>
+      </w:r>
+      <w:proofErr w:type="spellStart"/>
+      <w:r>
+        <w:t>missões</w:t>
+      </w:r>
+      <w:proofErr w:type="spellEnd"/>
+      <w:r>
+        <w:t xml:space="preserve">, </w:t>
+      </w:r>
+      <w:proofErr w:type="spellStart"/>
+      <w:r>
+        <w:t>conquistas</w:t>
+      </w:r>
+      <w:proofErr w:type="spellEnd"/>
+      <w:r>
+        <w:t xml:space="preserve"> e gift cards </w:t>
+      </w:r>
+      <w:proofErr w:type="spellStart"/>
+      <w:r>
+        <w:t>disponíveis</w:t>
+      </w:r>
+      <w:proofErr w:type="spellEnd"/>
+      <w:r>
+        <w:t xml:space="preserve">, </w:t>
+      </w:r>
+      <w:proofErr w:type="spellStart"/>
+      <w:r>
+        <w:t>modera</w:t>
+      </w:r>
+      <w:proofErr w:type="spellEnd"/>
+      <w:r>
+        <w:t xml:space="preserve"> </w:t>
+      </w:r>
+      <w:proofErr w:type="spellStart"/>
+      <w:r>
+        <w:t>conteúdo</w:t>
+      </w:r>
+      <w:proofErr w:type="spellEnd"/>
+      <w:r>
+        <w:t xml:space="preserve"> e </w:t>
+      </w:r>
+      <w:proofErr w:type="spellStart"/>
+      <w:r>
+        <w:t>monitora</w:t>
+      </w:r>
+      <w:proofErr w:type="spellEnd"/>
+      <w:r>
+        <w:t xml:space="preserve"> a </w:t>
+      </w:r>
+      <w:proofErr w:type="spellStart"/>
+      <w:r>
+        <w:t>saúde</w:t>
+      </w:r>
+      <w:proofErr w:type="spellEnd"/>
+      <w:r>
+        <w:t xml:space="preserve"> do </w:t>
+      </w:r>
+      <w:proofErr w:type="spellStart"/>
+      <w:r>
+        <w:t>sistema</w:t>
+      </w:r>
+      <w:proofErr w:type="spellEnd"/>
+      <w:r>
+        <w:t xml:space="preserve">. </w:t>
+      </w:r>
+      <w:proofErr w:type="spellStart"/>
+      <w:r>
+        <w:t>Não</w:t>
+      </w:r>
+      <w:proofErr w:type="spellEnd"/>
+      <w:r>
+        <w:t xml:space="preserve"> </w:t>
+      </w:r>
+      <w:proofErr w:type="spellStart"/>
+      <w:r>
+        <w:t>tem</w:t>
+      </w:r>
+      <w:proofErr w:type="spellEnd"/>
+      <w:r>
+        <w:t xml:space="preserve"> </w:t>
+      </w:r>
+      <w:proofErr w:type="spellStart"/>
+      <w:r>
+        <w:t>acesso</w:t>
+      </w:r>
+      <w:proofErr w:type="spellEnd"/>
+      <w:r>
+        <w:t xml:space="preserve"> </w:t>
+      </w:r>
+      <w:proofErr w:type="spellStart"/>
+      <w:r>
+        <w:t>aos</w:t>
+      </w:r>
+      <w:proofErr w:type="spellEnd"/>
+      <w:r>
+        <w:t xml:space="preserve"> dados privados dos </w:t>
+      </w:r>
+      <w:proofErr w:type="spellStart"/>
+      <w:r>
+        <w:t>casais</w:t>
+      </w:r>
+      <w:proofErr w:type="spellEnd"/>
+      <w:r>
+        <w:t>.</w:t>
+      </w:r>
+    </w:p>
+    <w:p>
+      <w:pPr>
+        <w:jc w:val="both"/>
+      </w:pPr>
+    </w:p>
+    <w:p>
+      <w:pPr>
+        <w:jc w:val="both"/>
+      </w:pPr>
+      <w:r>
+        <w:rPr>
+          <w:b/>
+          <w:bCs/>
+        </w:rPr>
+        <w:t xml:space="preserve">Sistema de </w:t>
+      </w:r>
+      <w:proofErr w:type="spellStart"/>
+      <w:r>
+        <w:rPr>
+          <w:b/>
+          <w:bCs/>
+        </w:rPr>
+        <w:t>Notificação</w:t>
+      </w:r>
+      <w:proofErr w:type="spellEnd"/>
+      <w:r>
+        <w:rPr>
+          <w:b/>
+          <w:bCs/>
+        </w:rPr>
+        <w:t xml:space="preserve"> (FCM)</w:t>
+      </w:r>
+      <w:r>
+        <w:t xml:space="preserve"> é o </w:t>
+      </w:r>
+      <w:proofErr w:type="spellStart"/>
+      <w:r>
+        <w:t>serviço</w:t>
+      </w:r>
+      <w:proofErr w:type="spellEnd"/>
+      <w:r>
+        <w:t xml:space="preserve"> </w:t>
+      </w:r>
+      <w:proofErr w:type="spellStart"/>
+      <w:r>
+        <w:t>externo</w:t>
+      </w:r>
+      <w:proofErr w:type="spellEnd"/>
+      <w:r>
+        <w:t xml:space="preserve"> do Firebase </w:t>
+      </w:r>
+      <w:proofErr w:type="spellStart"/>
+      <w:r>
+        <w:t>acionado</w:t>
+      </w:r>
+      <w:proofErr w:type="spellEnd"/>
+      <w:r>
+        <w:t xml:space="preserve"> </w:t>
+      </w:r>
+      <w:proofErr w:type="spellStart"/>
+      <w:r>
+        <w:t>pelo</w:t>
+      </w:r>
+      <w:proofErr w:type="spellEnd"/>
+      <w:r>
+        <w:t xml:space="preserve"> back-end para </w:t>
+      </w:r>
+      <w:proofErr w:type="spellStart"/>
+      <w:r>
+        <w:t>entregar</w:t>
+      </w:r>
+      <w:proofErr w:type="spellEnd"/>
+      <w:r>
+        <w:t xml:space="preserve"> push notifications </w:t>
+      </w:r>
+      <w:proofErr w:type="spellStart"/>
+      <w:r>
+        <w:t>aos</w:t>
+      </w:r>
+      <w:proofErr w:type="spellEnd"/>
+      <w:r>
+        <w:t xml:space="preserve"> </w:t>
+      </w:r>
+      <w:proofErr w:type="spellStart"/>
+      <w:r>
+        <w:t>dispositivos</w:t>
+      </w:r>
+      <w:proofErr w:type="spellEnd"/>
+      <w:r>
+        <w:t xml:space="preserve"> dos </w:t>
+      </w:r>
+      <w:proofErr w:type="spellStart"/>
+      <w:r>
+        <w:t>parceiros</w:t>
+      </w:r>
+      <w:proofErr w:type="spellEnd"/>
+      <w:r>
+        <w:t xml:space="preserve">, tais </w:t>
+      </w:r>
+      <w:proofErr w:type="spellStart"/>
+      <w:r>
+        <w:t>como</w:t>
+      </w:r>
+      <w:proofErr w:type="spellEnd"/>
+      <w:r>
+        <w:t xml:space="preserve"> </w:t>
+      </w:r>
+      <w:proofErr w:type="spellStart"/>
+      <w:r>
+        <w:t>lembretes</w:t>
       </w:r>
       <w:proofErr w:type="spellEnd"/>
       <w:r>
@@ -1613,15 +2421,219 @@
       </w:r>
       <w:proofErr w:type="spellStart"/>
       <w:r>
-        <w:t>cada</w:t>
-      </w:r>
-      <w:proofErr w:type="spellEnd"/>
-      <w:r>
-        <w:t xml:space="preserve"> um dos </w:t>
-      </w:r>
-      <w:proofErr w:type="spellStart"/>
-      <w:r>
-        <w:t>atores</w:t>
+        <w:t>datas</w:t>
+      </w:r>
+      <w:proofErr w:type="spellEnd"/>
+      <w:r>
+        <w:t xml:space="preserve"> </w:t>
+      </w:r>
+      <w:proofErr w:type="spellStart"/>
+      <w:r>
+        <w:t>especiais</w:t>
+      </w:r>
+      <w:proofErr w:type="spellEnd"/>
+      <w:r>
+        <w:t xml:space="preserve">, </w:t>
+      </w:r>
+      <w:proofErr w:type="spellStart"/>
+      <w:r>
+        <w:t>alertas</w:t>
+      </w:r>
+      <w:proofErr w:type="spellEnd"/>
+      <w:r>
+        <w:t xml:space="preserve"> de streak, </w:t>
+      </w:r>
+      <w:proofErr w:type="spellStart"/>
+      <w:r>
+        <w:t>avisos</w:t>
+      </w:r>
+      <w:proofErr w:type="spellEnd"/>
+      <w:r>
+        <w:t xml:space="preserve"> de </w:t>
+      </w:r>
+      <w:proofErr w:type="spellStart"/>
+      <w:r>
+        <w:t>missão</w:t>
+      </w:r>
+      <w:proofErr w:type="spellEnd"/>
+      <w:r>
+        <w:t xml:space="preserve"> </w:t>
+      </w:r>
+      <w:proofErr w:type="spellStart"/>
+      <w:r>
+        <w:t>semanal</w:t>
+      </w:r>
+      <w:proofErr w:type="spellEnd"/>
+      <w:r>
+        <w:t xml:space="preserve"> e </w:t>
+      </w:r>
+      <w:proofErr w:type="spellStart"/>
+      <w:r>
+        <w:t>notificação</w:t>
+      </w:r>
+      <w:proofErr w:type="spellEnd"/>
+      <w:r>
+        <w:t xml:space="preserve"> de </w:t>
+      </w:r>
+      <w:proofErr w:type="spellStart"/>
+      <w:r>
+        <w:t>chegada</w:t>
+      </w:r>
+      <w:proofErr w:type="spellEnd"/>
+      <w:r>
+        <w:t xml:space="preserve"> </w:t>
+      </w:r>
+      <w:proofErr w:type="spellStart"/>
+      <w:r>
+        <w:t>em</w:t>
+      </w:r>
+      <w:proofErr w:type="spellEnd"/>
+      <w:r>
+        <w:t xml:space="preserve"> casa.</w:t>
+      </w:r>
+    </w:p>
+    <w:p>
+      <w:pPr>
+        <w:jc w:val="both"/>
+      </w:pPr>
+    </w:p>
+    <w:p>
+      <w:pPr>
+        <w:jc w:val="both"/>
+      </w:pPr>
+      <w:proofErr w:type="spellStart"/>
+      <w:r>
+        <w:rPr>
+          <w:b/>
+          <w:bCs/>
+        </w:rPr>
+        <w:t>Provedor</w:t>
+      </w:r>
+      <w:proofErr w:type="spellEnd"/>
+      <w:r>
+        <w:rPr>
+          <w:b/>
+          <w:bCs/>
+        </w:rPr>
+        <w:t xml:space="preserve"> de Gift Cards</w:t>
+      </w:r>
+      <w:r>
+        <w:t xml:space="preserve"> é o </w:t>
+      </w:r>
+      <w:proofErr w:type="spellStart"/>
+      <w:r>
+        <w:t>serviço</w:t>
+      </w:r>
+      <w:proofErr w:type="spellEnd"/>
+      <w:r>
+        <w:t xml:space="preserve"> </w:t>
+      </w:r>
+      <w:proofErr w:type="spellStart"/>
+      <w:r>
+        <w:t>externo</w:t>
+      </w:r>
+      <w:proofErr w:type="spellEnd"/>
+      <w:r>
+        <w:t xml:space="preserve"> </w:t>
+      </w:r>
+      <w:proofErr w:type="spellStart"/>
+      <w:r>
+        <w:t>integrado</w:t>
+      </w:r>
+      <w:proofErr w:type="spellEnd"/>
+      <w:r>
+        <w:t xml:space="preserve"> </w:t>
+      </w:r>
+      <w:proofErr w:type="spellStart"/>
+      <w:r>
+        <w:t>ao</w:t>
+      </w:r>
+      <w:proofErr w:type="spellEnd"/>
+      <w:r>
+        <w:t xml:space="preserve"> Gift Center que </w:t>
+      </w:r>
+      <w:proofErr w:type="spellStart"/>
+      <w:r>
+        <w:t>processa</w:t>
+      </w:r>
+      <w:proofErr w:type="spellEnd"/>
+      <w:r>
+        <w:t xml:space="preserve"> a </w:t>
+      </w:r>
+      <w:proofErr w:type="spellStart"/>
+      <w:r>
+        <w:t>compra</w:t>
+      </w:r>
+      <w:proofErr w:type="spellEnd"/>
+      <w:r>
+        <w:t xml:space="preserve"> e </w:t>
+      </w:r>
+      <w:proofErr w:type="spellStart"/>
+      <w:r>
+        <w:t>entrega</w:t>
+      </w:r>
+      <w:proofErr w:type="spellEnd"/>
+      <w:r>
+        <w:t xml:space="preserve"> digital de gift cards e </w:t>
+      </w:r>
+      <w:proofErr w:type="spellStart"/>
+      <w:r>
+        <w:t>experiências</w:t>
+      </w:r>
+      <w:proofErr w:type="spellEnd"/>
+      <w:r>
+        <w:t xml:space="preserve"> </w:t>
+      </w:r>
+      <w:proofErr w:type="spellStart"/>
+      <w:r>
+        <w:t>enviadas</w:t>
+      </w:r>
+      <w:proofErr w:type="spellEnd"/>
+      <w:r>
+        <w:t xml:space="preserve"> de um </w:t>
+      </w:r>
+      <w:proofErr w:type="spellStart"/>
+      <w:r>
+        <w:t>parceiro</w:t>
+      </w:r>
+      <w:proofErr w:type="spellEnd"/>
+      <w:r>
+        <w:t xml:space="preserve"> </w:t>
+      </w:r>
+      <w:proofErr w:type="spellStart"/>
+      <w:r>
+        <w:t>ao</w:t>
+      </w:r>
+      <w:proofErr w:type="spellEnd"/>
+      <w:r>
+        <w:t xml:space="preserve"> outro.</w:t>
+      </w:r>
+    </w:p>
+    <w:p>
+      <w:pPr>
+        <w:jc w:val="both"/>
+      </w:pPr>
+      <w:r>
+        <w:rPr>
+          <w:b/>
+          <w:bCs/>
+        </w:rPr>
+        <w:t>Google Maps API</w:t>
+      </w:r>
+      <w:r>
+        <w:t xml:space="preserve"> é o </w:t>
+      </w:r>
+      <w:proofErr w:type="spellStart"/>
+      <w:r>
+        <w:t>serviço</w:t>
+      </w:r>
+      <w:proofErr w:type="spellEnd"/>
+      <w:r>
+        <w:t xml:space="preserve"> </w:t>
+      </w:r>
+      <w:proofErr w:type="spellStart"/>
+      <w:r>
+        <w:t>externo</w:t>
       </w:r>
       <w:proofErr w:type="spellEnd"/>
       <w:r>
@@ -1629,19 +2641,1169 @@
       </w:r>
       <w:proofErr w:type="spellStart"/>
       <w:r>
-        <w:t>interagem</w:t>
-      </w:r>
-      <w:proofErr w:type="spellEnd"/>
-      <w:r>
-        <w:t xml:space="preserve"> com o </w:t>
-      </w:r>
-      <w:proofErr w:type="spellStart"/>
-      <w:r>
-        <w:t>sistema</w:t>
+        <w:t>fornece</w:t>
+      </w:r>
+      <w:proofErr w:type="spellEnd"/>
+      <w:r>
+        <w:t xml:space="preserve"> </w:t>
+      </w:r>
+      <w:proofErr w:type="spellStart"/>
+      <w:r>
+        <w:t>geolocalização</w:t>
+      </w:r>
+      <w:proofErr w:type="spellEnd"/>
+      <w:r>
+        <w:t xml:space="preserve">, </w:t>
+      </w:r>
+      <w:proofErr w:type="spellStart"/>
+      <w:r>
+        <w:t>busca</w:t>
+      </w:r>
+      <w:proofErr w:type="spellEnd"/>
+      <w:r>
+        <w:t xml:space="preserve"> de </w:t>
+      </w:r>
+      <w:proofErr w:type="spellStart"/>
+      <w:r>
+        <w:t>lugares</w:t>
+      </w:r>
+      <w:proofErr w:type="spellEnd"/>
+      <w:r>
+        <w:t xml:space="preserve"> e </w:t>
+      </w:r>
+      <w:proofErr w:type="spellStart"/>
+      <w:r>
+        <w:t>renderização</w:t>
+      </w:r>
+      <w:proofErr w:type="spellEnd"/>
+      <w:r>
+        <w:t xml:space="preserve"> do </w:t>
+      </w:r>
+      <w:proofErr w:type="spellStart"/>
+      <w:r>
+        <w:t>mapa</w:t>
+      </w:r>
+      <w:proofErr w:type="spellEnd"/>
+      <w:r>
+        <w:t xml:space="preserve"> de </w:t>
+      </w:r>
+      <w:proofErr w:type="spellStart"/>
+      <w:r>
+        <w:t>memórias</w:t>
+      </w:r>
+      <w:proofErr w:type="spellEnd"/>
+      <w:r>
+        <w:t xml:space="preserve"> do </w:t>
+      </w:r>
+      <w:proofErr w:type="spellStart"/>
+      <w:r>
+        <w:t>casal</w:t>
       </w:r>
       <w:proofErr w:type="spellEnd"/>
       <w:r>
         <w:t>.</w:t>
+      </w:r>
+    </w:p>
+    <w:p>
+      <w:pPr>
+        <w:jc w:val="both"/>
+      </w:pPr>
+    </w:p>
+    <w:p>
+      <w:pPr>
+        <w:jc w:val="both"/>
+      </w:pPr>
+      <w:r>
+        <w:rPr>
+          <w:b/>
+          <w:bCs/>
+        </w:rPr>
+        <w:t xml:space="preserve">Gateway de </w:t>
+      </w:r>
+      <w:proofErr w:type="spellStart"/>
+      <w:r>
+        <w:rPr>
+          <w:b/>
+          <w:bCs/>
+        </w:rPr>
+        <w:t>Pagamento</w:t>
+      </w:r>
+      <w:proofErr w:type="spellEnd"/>
+      <w:r>
+        <w:t xml:space="preserve"> é o </w:t>
+      </w:r>
+      <w:proofErr w:type="spellStart"/>
+      <w:r>
+        <w:t>responsável</w:t>
+      </w:r>
+      <w:proofErr w:type="spellEnd"/>
+      <w:r>
+        <w:t xml:space="preserve"> </w:t>
+      </w:r>
+      <w:proofErr w:type="spellStart"/>
+      <w:r>
+        <w:t>por</w:t>
+      </w:r>
+      <w:proofErr w:type="spellEnd"/>
+      <w:r>
+        <w:t xml:space="preserve"> </w:t>
+      </w:r>
+      <w:proofErr w:type="spellStart"/>
+      <w:r>
+        <w:t>processar</w:t>
+      </w:r>
+      <w:proofErr w:type="spellEnd"/>
+      <w:r>
+        <w:t xml:space="preserve"> </w:t>
+      </w:r>
+      <w:proofErr w:type="spellStart"/>
+      <w:r>
+        <w:t>os</w:t>
+      </w:r>
+      <w:proofErr w:type="spellEnd"/>
+      <w:r>
+        <w:t xml:space="preserve"> </w:t>
+      </w:r>
+      <w:proofErr w:type="spellStart"/>
+      <w:r>
+        <w:t>pagamentos</w:t>
+      </w:r>
+      <w:proofErr w:type="spellEnd"/>
+      <w:r>
+        <w:t xml:space="preserve"> </w:t>
+      </w:r>
+      <w:proofErr w:type="spellStart"/>
+      <w:r>
+        <w:t>realizados</w:t>
+      </w:r>
+      <w:proofErr w:type="spellEnd"/>
+      <w:r>
+        <w:t xml:space="preserve"> </w:t>
+      </w:r>
+      <w:proofErr w:type="spellStart"/>
+      <w:r>
+        <w:t>dentro</w:t>
+      </w:r>
+      <w:proofErr w:type="spellEnd"/>
+      <w:r>
+        <w:t xml:space="preserve"> do </w:t>
+      </w:r>
+      <w:proofErr w:type="spellStart"/>
+      <w:r>
+        <w:t>aplicativo</w:t>
+      </w:r>
+      <w:proofErr w:type="spellEnd"/>
+      <w:r>
+        <w:t xml:space="preserve"> para </w:t>
+      </w:r>
+      <w:proofErr w:type="spellStart"/>
+      <w:r>
+        <w:t>compra</w:t>
+      </w:r>
+      <w:proofErr w:type="spellEnd"/>
+      <w:r>
+        <w:t xml:space="preserve"> de </w:t>
+      </w:r>
+      <w:proofErr w:type="spellStart"/>
+      <w:r>
+        <w:t>acessórios</w:t>
+      </w:r>
+      <w:proofErr w:type="spellEnd"/>
+      <w:r>
+        <w:t xml:space="preserve">, skins, </w:t>
+      </w:r>
+      <w:proofErr w:type="spellStart"/>
+      <w:r>
+        <w:t>mascot</w:t>
+      </w:r>
+      <w:r>
+        <w:t>e</w:t>
+      </w:r>
+      <w:r>
+        <w:t>s</w:t>
+      </w:r>
+      <w:proofErr w:type="spellEnd"/>
+      <w:r>
+        <w:t xml:space="preserve"> </w:t>
+      </w:r>
+      <w:proofErr w:type="spellStart"/>
+      <w:r>
+        <w:t>ou</w:t>
+      </w:r>
+      <w:proofErr w:type="spellEnd"/>
+      <w:r>
+        <w:t xml:space="preserve"> gift cards.</w:t>
+      </w:r>
+    </w:p>
+    <w:p>
+      <w:pPr>
+        <w:jc w:val="both"/>
+      </w:pPr>
+      <w:r>
+        <w:rPr>
+          <w:noProof/>
+        </w:rPr>
+        <w:lastRenderedPageBreak/>
+        <w:drawing>
+          <wp:inline distT="0" distB="0" distL="0" distR="0" wp14:anchorId="49F81C41" wp14:editId="19C22E91">
+            <wp:extent cx="4038600" cy="2305050"/>
+            <wp:effectExtent l="0" t="0" r="0" b="0"/>
+            <wp:docPr id="3" name="Imagem 3"/>
+            <wp:cNvGraphicFramePr>
+              <a:graphicFrameLocks xmlns:a="http://schemas.openxmlformats.org/drawingml/2006/main" noChangeAspect="1"/>
+            </wp:cNvGraphicFramePr>
+            <a:graphic xmlns:a="http://schemas.openxmlformats.org/drawingml/2006/main">
+              <a:graphicData uri="http://schemas.openxmlformats.org/drawingml/2006/picture">
+                <pic:pic xmlns:pic="http://schemas.openxmlformats.org/drawingml/2006/picture">
+                  <pic:nvPicPr>
+                    <pic:cNvPr id="0" name="Picture 3"/>
+                    <pic:cNvPicPr>
+                      <a:picLocks noChangeAspect="1" noChangeArrowheads="1"/>
+                    </pic:cNvPicPr>
+                  </pic:nvPicPr>
+                  <pic:blipFill>
+                    <a:blip r:embed="rId11">
+                      <a:extLst>
+                        <a:ext uri="{28A0092B-C50C-407E-A947-70E740481C1C}">
+                          <a14:useLocalDpi xmlns:a14="http://schemas.microsoft.com/office/drawing/2010/main" val="0"/>
+                        </a:ext>
+                      </a:extLst>
+                    </a:blip>
+                    <a:srcRect/>
+                    <a:stretch>
+                      <a:fillRect/>
+                    </a:stretch>
+                  </pic:blipFill>
+                  <pic:spPr bwMode="auto">
+                    <a:xfrm>
+                      <a:off x="0" y="0"/>
+                      <a:ext cx="4038600" cy="2305050"/>
+                    </a:xfrm>
+                    <a:prstGeom prst="rect">
+                      <a:avLst/>
+                    </a:prstGeom>
+                    <a:noFill/>
+                    <a:ln>
+                      <a:noFill/>
+                    </a:ln>
+                  </pic:spPr>
+                </pic:pic>
+              </a:graphicData>
+            </a:graphic>
+          </wp:inline>
+        </w:drawing>
+      </w:r>
+    </w:p>
+    <w:p>
+      <w:pPr>
+        <w:pStyle w:val="Ttulo2"/>
+        <w:numPr>
+          <w:ilvl w:val="1"/>
+          <w:numId w:val="1"/>
+        </w:numPr>
+        <w:ind w:right="2985"/>
+        <w:jc w:val="both"/>
+      </w:pPr>
+      <w:bookmarkStart w:id="6" w:name="_2et92p0" w:colFirst="0" w:colLast="0"/>
+      <w:bookmarkEnd w:id="6"/>
+      <w:proofErr w:type="spellStart"/>
+      <w:r>
+        <w:t>Modelo</w:t>
+      </w:r>
+      <w:proofErr w:type="spellEnd"/>
+      <w:r>
+        <w:t xml:space="preserve"> de Casos de </w:t>
+      </w:r>
+      <w:proofErr w:type="spellStart"/>
+      <w:r>
+        <w:t>Uso</w:t>
+      </w:r>
+      <w:proofErr w:type="spellEnd"/>
+      <w:r>
+        <w:t xml:space="preserve"> </w:t>
+      </w:r>
+    </w:p>
+    <w:p>
+      <w:pPr>
+        <w:jc w:val="both"/>
+      </w:pPr>
+      <w:r>
+        <w:t xml:space="preserve">HU-01 — Como </w:t>
+      </w:r>
+      <w:proofErr w:type="spellStart"/>
+      <w:r>
+        <w:t>casal</w:t>
+      </w:r>
+      <w:proofErr w:type="spellEnd"/>
+      <w:r>
+        <w:t xml:space="preserve">, </w:t>
+      </w:r>
+      <w:proofErr w:type="spellStart"/>
+      <w:r>
+        <w:t>queremos</w:t>
+      </w:r>
+      <w:proofErr w:type="spellEnd"/>
+      <w:r>
+        <w:t xml:space="preserve"> registrar </w:t>
+      </w:r>
+      <w:proofErr w:type="spellStart"/>
+      <w:r>
+        <w:t>nosso</w:t>
+      </w:r>
+      <w:proofErr w:type="spellEnd"/>
+      <w:r>
+        <w:t xml:space="preserve"> humor </w:t>
+      </w:r>
+      <w:proofErr w:type="spellStart"/>
+      <w:r>
+        <w:t>diário</w:t>
+      </w:r>
+      <w:proofErr w:type="spellEnd"/>
+      <w:r>
+        <w:t xml:space="preserve"> para </w:t>
+      </w:r>
+      <w:proofErr w:type="spellStart"/>
+      <w:r>
+        <w:t>acompanhar</w:t>
+      </w:r>
+      <w:proofErr w:type="spellEnd"/>
+      <w:r>
+        <w:t xml:space="preserve"> o </w:t>
+      </w:r>
+      <w:proofErr w:type="spellStart"/>
+      <w:r>
+        <w:t>bem-estar</w:t>
+      </w:r>
+      <w:proofErr w:type="spellEnd"/>
+      <w:r>
+        <w:t xml:space="preserve"> </w:t>
+      </w:r>
+      <w:proofErr w:type="spellStart"/>
+      <w:r>
+        <w:t>emocional</w:t>
+      </w:r>
+      <w:proofErr w:type="spellEnd"/>
+      <w:r>
+        <w:t xml:space="preserve"> da </w:t>
+      </w:r>
+      <w:proofErr w:type="spellStart"/>
+      <w:r>
+        <w:t>relação</w:t>
+      </w:r>
+      <w:proofErr w:type="spellEnd"/>
+      <w:r>
+        <w:t xml:space="preserve"> e </w:t>
+      </w:r>
+      <w:proofErr w:type="spellStart"/>
+      <w:r>
+        <w:t>manter</w:t>
+      </w:r>
+      <w:proofErr w:type="spellEnd"/>
+      <w:r>
+        <w:t xml:space="preserve"> </w:t>
+      </w:r>
+      <w:proofErr w:type="spellStart"/>
+      <w:r>
+        <w:t>nossa</w:t>
+      </w:r>
+      <w:proofErr w:type="spellEnd"/>
+      <w:r>
+        <w:t xml:space="preserve"> </w:t>
+      </w:r>
+      <w:proofErr w:type="spellStart"/>
+      <w:r>
+        <w:t>sequência</w:t>
+      </w:r>
+      <w:proofErr w:type="spellEnd"/>
+      <w:r>
+        <w:t xml:space="preserve"> </w:t>
+      </w:r>
+      <w:proofErr w:type="spellStart"/>
+      <w:r>
+        <w:t>ativa</w:t>
+      </w:r>
+      <w:proofErr w:type="spellEnd"/>
+      <w:r>
+        <w:t xml:space="preserve"> no app.</w:t>
+      </w:r>
+    </w:p>
+    <w:p>
+      <w:pPr>
+        <w:jc w:val="both"/>
+      </w:pPr>
+    </w:p>
+    <w:p>
+      <w:pPr>
+        <w:jc w:val="both"/>
+      </w:pPr>
+      <w:r>
+        <w:t xml:space="preserve">HU-02 — Como </w:t>
+      </w:r>
+      <w:proofErr w:type="spellStart"/>
+      <w:r>
+        <w:t>casal</w:t>
+      </w:r>
+      <w:proofErr w:type="spellEnd"/>
+      <w:r>
+        <w:t xml:space="preserve">, </w:t>
+      </w:r>
+      <w:proofErr w:type="spellStart"/>
+      <w:r>
+        <w:t>queremos</w:t>
+      </w:r>
+      <w:proofErr w:type="spellEnd"/>
+      <w:r>
+        <w:t xml:space="preserve"> </w:t>
+      </w:r>
+      <w:proofErr w:type="spellStart"/>
+      <w:r>
+        <w:t>cumprir</w:t>
+      </w:r>
+      <w:proofErr w:type="spellEnd"/>
+      <w:r>
+        <w:t xml:space="preserve"> </w:t>
+      </w:r>
+      <w:proofErr w:type="spellStart"/>
+      <w:r>
+        <w:t>missões</w:t>
+      </w:r>
+      <w:proofErr w:type="spellEnd"/>
+      <w:r>
+        <w:t xml:space="preserve"> </w:t>
+      </w:r>
+      <w:proofErr w:type="spellStart"/>
+      <w:r>
+        <w:t>semanais</w:t>
+      </w:r>
+      <w:proofErr w:type="spellEnd"/>
+      <w:r>
+        <w:t xml:space="preserve"> </w:t>
+      </w:r>
+      <w:proofErr w:type="spellStart"/>
+      <w:r>
+        <w:t>sorteadas</w:t>
+      </w:r>
+      <w:proofErr w:type="spellEnd"/>
+      <w:r>
+        <w:t xml:space="preserve"> </w:t>
+      </w:r>
+      <w:proofErr w:type="spellStart"/>
+      <w:r>
+        <w:t>automaticamente</w:t>
+      </w:r>
+      <w:proofErr w:type="spellEnd"/>
+      <w:r>
+        <w:t xml:space="preserve"> para </w:t>
+      </w:r>
+      <w:proofErr w:type="spellStart"/>
+      <w:r>
+        <w:t>ter</w:t>
+      </w:r>
+      <w:proofErr w:type="spellEnd"/>
+      <w:r>
+        <w:t xml:space="preserve"> </w:t>
+      </w:r>
+      <w:proofErr w:type="spellStart"/>
+      <w:r>
+        <w:t>sugestões</w:t>
+      </w:r>
+      <w:proofErr w:type="spellEnd"/>
+      <w:r>
+        <w:t xml:space="preserve"> de </w:t>
+      </w:r>
+      <w:proofErr w:type="spellStart"/>
+      <w:r>
+        <w:t>atividades</w:t>
+      </w:r>
+      <w:proofErr w:type="spellEnd"/>
+      <w:r>
+        <w:t xml:space="preserve"> que </w:t>
+      </w:r>
+      <w:proofErr w:type="spellStart"/>
+      <w:r>
+        <w:t>fortaleçam</w:t>
+      </w:r>
+      <w:proofErr w:type="spellEnd"/>
+      <w:r>
+        <w:t xml:space="preserve"> </w:t>
+      </w:r>
+      <w:proofErr w:type="spellStart"/>
+      <w:r>
+        <w:t>nossa</w:t>
+      </w:r>
+      <w:proofErr w:type="spellEnd"/>
+      <w:r>
+        <w:t xml:space="preserve"> </w:t>
+      </w:r>
+      <w:proofErr w:type="spellStart"/>
+      <w:r>
+        <w:t>conexão</w:t>
+      </w:r>
+      <w:proofErr w:type="spellEnd"/>
+      <w:r>
+        <w:t>.</w:t>
+      </w:r>
+    </w:p>
+    <w:p>
+      <w:pPr>
+        <w:jc w:val="both"/>
+      </w:pPr>
+    </w:p>
+    <w:p>
+      <w:pPr>
+        <w:jc w:val="both"/>
+      </w:pPr>
+      <w:r>
+        <w:t xml:space="preserve">HU-03 — Como </w:t>
+      </w:r>
+      <w:proofErr w:type="spellStart"/>
+      <w:r>
+        <w:t>casal</w:t>
+      </w:r>
+      <w:proofErr w:type="spellEnd"/>
+      <w:r>
+        <w:t xml:space="preserve">, </w:t>
+      </w:r>
+      <w:proofErr w:type="spellStart"/>
+      <w:r>
+        <w:t>queremos</w:t>
+      </w:r>
+      <w:proofErr w:type="spellEnd"/>
+      <w:r>
+        <w:t xml:space="preserve"> </w:t>
+      </w:r>
+      <w:proofErr w:type="spellStart"/>
+      <w:r>
+        <w:t>criar</w:t>
+      </w:r>
+      <w:proofErr w:type="spellEnd"/>
+      <w:r>
+        <w:t xml:space="preserve"> </w:t>
+      </w:r>
+      <w:proofErr w:type="spellStart"/>
+      <w:r>
+        <w:t>metas</w:t>
+      </w:r>
+      <w:proofErr w:type="spellEnd"/>
+      <w:r>
+        <w:t xml:space="preserve">, </w:t>
+      </w:r>
+      <w:proofErr w:type="spellStart"/>
+      <w:r>
+        <w:t>notas</w:t>
+      </w:r>
+      <w:proofErr w:type="spellEnd"/>
+      <w:r>
+        <w:t xml:space="preserve"> e </w:t>
+      </w:r>
+      <w:proofErr w:type="spellStart"/>
+      <w:r>
+        <w:t>listas</w:t>
+      </w:r>
+      <w:proofErr w:type="spellEnd"/>
+      <w:r>
+        <w:t xml:space="preserve"> </w:t>
+      </w:r>
+      <w:proofErr w:type="spellStart"/>
+      <w:r>
+        <w:t>compartilhadas</w:t>
+      </w:r>
+      <w:proofErr w:type="spellEnd"/>
+      <w:r>
+        <w:t xml:space="preserve"> para </w:t>
+      </w:r>
+      <w:proofErr w:type="spellStart"/>
+      <w:r>
+        <w:t>planejar</w:t>
+      </w:r>
+      <w:proofErr w:type="spellEnd"/>
+      <w:r>
+        <w:t xml:space="preserve"> e </w:t>
+      </w:r>
+      <w:proofErr w:type="spellStart"/>
+      <w:r>
+        <w:t>organizar</w:t>
+      </w:r>
+      <w:proofErr w:type="spellEnd"/>
+      <w:r>
+        <w:t xml:space="preserve"> </w:t>
+      </w:r>
+      <w:proofErr w:type="spellStart"/>
+      <w:r>
+        <w:t>nossa</w:t>
+      </w:r>
+      <w:proofErr w:type="spellEnd"/>
+      <w:r>
+        <w:t xml:space="preserve"> </w:t>
+      </w:r>
+      <w:proofErr w:type="spellStart"/>
+      <w:r>
+        <w:t>rotina</w:t>
+      </w:r>
+      <w:proofErr w:type="spellEnd"/>
+      <w:r>
+        <w:t xml:space="preserve"> num </w:t>
+      </w:r>
+      <w:proofErr w:type="spellStart"/>
+      <w:r>
+        <w:t>só</w:t>
+      </w:r>
+      <w:proofErr w:type="spellEnd"/>
+      <w:r>
+        <w:t xml:space="preserve"> </w:t>
+      </w:r>
+      <w:proofErr w:type="spellStart"/>
+      <w:r>
+        <w:t>lugar</w:t>
+      </w:r>
+      <w:proofErr w:type="spellEnd"/>
+      <w:r>
+        <w:t>.</w:t>
+      </w:r>
+    </w:p>
+    <w:p>
+      <w:pPr>
+        <w:jc w:val="both"/>
+      </w:pPr>
+    </w:p>
+    <w:p>
+      <w:pPr>
+        <w:jc w:val="both"/>
+      </w:pPr>
+      <w:r>
+        <w:t xml:space="preserve">HU-04 — Como </w:t>
+      </w:r>
+      <w:proofErr w:type="spellStart"/>
+      <w:r>
+        <w:t>usuário</w:t>
+      </w:r>
+      <w:proofErr w:type="spellEnd"/>
+      <w:r>
+        <w:t xml:space="preserve">, </w:t>
+      </w:r>
+      <w:proofErr w:type="spellStart"/>
+      <w:r>
+        <w:t>quero</w:t>
+      </w:r>
+      <w:proofErr w:type="spellEnd"/>
+      <w:r>
+        <w:t xml:space="preserve"> </w:t>
+      </w:r>
+      <w:proofErr w:type="spellStart"/>
+      <w:r>
+        <w:t>personalizar</w:t>
+      </w:r>
+      <w:proofErr w:type="spellEnd"/>
+      <w:r>
+        <w:t xml:space="preserve"> o </w:t>
+      </w:r>
+      <w:proofErr w:type="spellStart"/>
+      <w:r>
+        <w:t>mascote</w:t>
+      </w:r>
+      <w:proofErr w:type="spellEnd"/>
+      <w:r>
+        <w:t xml:space="preserve"> e </w:t>
+      </w:r>
+      <w:proofErr w:type="spellStart"/>
+      <w:r>
+        <w:t>acompanhar</w:t>
+      </w:r>
+      <w:proofErr w:type="spellEnd"/>
+      <w:r>
+        <w:t xml:space="preserve"> </w:t>
+      </w:r>
+      <w:proofErr w:type="spellStart"/>
+      <w:r>
+        <w:t>sua</w:t>
+      </w:r>
+      <w:proofErr w:type="spellEnd"/>
+      <w:r>
+        <w:t xml:space="preserve"> </w:t>
+      </w:r>
+      <w:proofErr w:type="spellStart"/>
+      <w:r>
+        <w:t>evolução</w:t>
+      </w:r>
+      <w:proofErr w:type="spellEnd"/>
+      <w:r>
+        <w:t>.</w:t>
+      </w:r>
+    </w:p>
+    <w:p>
+      <w:pPr>
+        <w:jc w:val="both"/>
+      </w:pPr>
+    </w:p>
+    <w:p>
+      <w:pPr>
+        <w:jc w:val="both"/>
+      </w:pPr>
+      <w:r>
+        <w:t xml:space="preserve">HU-05 — Como </w:t>
+      </w:r>
+      <w:proofErr w:type="spellStart"/>
+      <w:r>
+        <w:t>usuário</w:t>
+      </w:r>
+      <w:proofErr w:type="spellEnd"/>
+      <w:r>
+        <w:t xml:space="preserve">, </w:t>
+      </w:r>
+      <w:proofErr w:type="spellStart"/>
+      <w:r>
+        <w:t>quero</w:t>
+      </w:r>
+      <w:proofErr w:type="spellEnd"/>
+      <w:r>
+        <w:t xml:space="preserve"> </w:t>
+      </w:r>
+      <w:proofErr w:type="spellStart"/>
+      <w:r>
+        <w:t>gerenciar</w:t>
+      </w:r>
+      <w:proofErr w:type="spellEnd"/>
+      <w:r>
+        <w:t xml:space="preserve"> </w:t>
+      </w:r>
+      <w:proofErr w:type="spellStart"/>
+      <w:r>
+        <w:t>lembretes</w:t>
+      </w:r>
+      <w:proofErr w:type="spellEnd"/>
+      <w:r>
+        <w:t xml:space="preserve"> de </w:t>
+      </w:r>
+      <w:proofErr w:type="spellStart"/>
+      <w:r>
+        <w:t>datas</w:t>
+      </w:r>
+      <w:proofErr w:type="spellEnd"/>
+      <w:r>
+        <w:t xml:space="preserve"> </w:t>
+      </w:r>
+      <w:proofErr w:type="spellStart"/>
+      <w:r>
+        <w:t>especiais</w:t>
+      </w:r>
+      <w:proofErr w:type="spellEnd"/>
+      <w:r>
+        <w:t xml:space="preserve"> e </w:t>
+      </w:r>
+      <w:proofErr w:type="spellStart"/>
+      <w:r>
+        <w:t>enviar</w:t>
+      </w:r>
+      <w:proofErr w:type="spellEnd"/>
+      <w:r>
+        <w:t xml:space="preserve"> </w:t>
+      </w:r>
+      <w:proofErr w:type="spellStart"/>
+      <w:r>
+        <w:t>presentes</w:t>
+      </w:r>
+      <w:proofErr w:type="spellEnd"/>
+      <w:r>
+        <w:t xml:space="preserve"> </w:t>
+      </w:r>
+      <w:proofErr w:type="spellStart"/>
+      <w:r>
+        <w:t>digitais</w:t>
+      </w:r>
+      <w:proofErr w:type="spellEnd"/>
+      <w:r>
+        <w:t xml:space="preserve"> </w:t>
+      </w:r>
+      <w:proofErr w:type="spellStart"/>
+      <w:r>
+        <w:t>pelo</w:t>
+      </w:r>
+      <w:proofErr w:type="spellEnd"/>
+      <w:r>
+        <w:t xml:space="preserve"> Gift Center para </w:t>
+      </w:r>
+      <w:proofErr w:type="spellStart"/>
+      <w:r>
+        <w:t>surpreender</w:t>
+      </w:r>
+      <w:proofErr w:type="spellEnd"/>
+      <w:r>
+        <w:t xml:space="preserve"> meu par.</w:t>
+      </w:r>
+    </w:p>
+    <w:p>
+      <w:pPr>
+        <w:jc w:val="both"/>
+      </w:pPr>
+    </w:p>
+    <w:p>
+      <w:pPr>
+        <w:jc w:val="both"/>
+      </w:pPr>
+      <w:r>
+        <w:t xml:space="preserve">HU-06 — Como </w:t>
+      </w:r>
+      <w:proofErr w:type="spellStart"/>
+      <w:r>
+        <w:t>casal</w:t>
+      </w:r>
+      <w:proofErr w:type="spellEnd"/>
+      <w:r>
+        <w:t xml:space="preserve">, </w:t>
+      </w:r>
+      <w:proofErr w:type="spellStart"/>
+      <w:r>
+        <w:t>queremos</w:t>
+      </w:r>
+      <w:proofErr w:type="spellEnd"/>
+      <w:r>
+        <w:t xml:space="preserve"> </w:t>
+      </w:r>
+      <w:proofErr w:type="spellStart"/>
+      <w:r>
+        <w:t>salvar</w:t>
+      </w:r>
+      <w:proofErr w:type="spellEnd"/>
+      <w:r>
+        <w:t xml:space="preserve"> </w:t>
+      </w:r>
+      <w:proofErr w:type="spellStart"/>
+      <w:r>
+        <w:t>lugares</w:t>
+      </w:r>
+      <w:proofErr w:type="spellEnd"/>
+      <w:r>
+        <w:t xml:space="preserve"> que </w:t>
+      </w:r>
+      <w:proofErr w:type="spellStart"/>
+      <w:r>
+        <w:t>visitamos</w:t>
+      </w:r>
+      <w:proofErr w:type="spellEnd"/>
+      <w:r>
+        <w:t xml:space="preserve"> e </w:t>
+      </w:r>
+      <w:proofErr w:type="spellStart"/>
+      <w:r>
+        <w:t>visualizá-los</w:t>
+      </w:r>
+      <w:proofErr w:type="spellEnd"/>
+      <w:r>
+        <w:t xml:space="preserve"> num </w:t>
+      </w:r>
+      <w:proofErr w:type="spellStart"/>
+      <w:r>
+        <w:t>mapa</w:t>
+      </w:r>
+      <w:proofErr w:type="spellEnd"/>
+      <w:r>
+        <w:t xml:space="preserve"> de </w:t>
+      </w:r>
+      <w:proofErr w:type="spellStart"/>
+      <w:r>
+        <w:t>memórias</w:t>
+      </w:r>
+      <w:proofErr w:type="spellEnd"/>
+      <w:r>
+        <w:t xml:space="preserve"> para registrar as </w:t>
+      </w:r>
+      <w:proofErr w:type="spellStart"/>
+      <w:r>
+        <w:t>experiências</w:t>
+      </w:r>
+      <w:proofErr w:type="spellEnd"/>
+      <w:r>
+        <w:t xml:space="preserve"> que </w:t>
+      </w:r>
+      <w:proofErr w:type="spellStart"/>
+      <w:r>
+        <w:t>vivemos</w:t>
+      </w:r>
+      <w:proofErr w:type="spellEnd"/>
+      <w:r>
+        <w:t xml:space="preserve"> </w:t>
+      </w:r>
+      <w:proofErr w:type="spellStart"/>
+      <w:r>
+        <w:t>juntos</w:t>
+      </w:r>
+      <w:proofErr w:type="spellEnd"/>
+      <w:r>
+        <w:t>.</w:t>
+      </w:r>
+    </w:p>
+    <w:p>
+      <w:pPr>
+        <w:jc w:val="both"/>
+      </w:pPr>
+    </w:p>
+    <w:p>
+      <w:pPr>
+        <w:jc w:val="both"/>
+      </w:pPr>
+      <w:r>
+        <w:t xml:space="preserve">HU-07 — Como </w:t>
+      </w:r>
+      <w:proofErr w:type="spellStart"/>
+      <w:r>
+        <w:t>casal</w:t>
+      </w:r>
+      <w:proofErr w:type="spellEnd"/>
+      <w:r>
+        <w:t xml:space="preserve">, </w:t>
+      </w:r>
+      <w:proofErr w:type="spellStart"/>
+      <w:r>
+        <w:t>queremos</w:t>
+      </w:r>
+      <w:proofErr w:type="spellEnd"/>
+      <w:r>
+        <w:t xml:space="preserve"> </w:t>
+      </w:r>
+      <w:proofErr w:type="spellStart"/>
+      <w:r>
+        <w:t>jogar</w:t>
+      </w:r>
+      <w:proofErr w:type="spellEnd"/>
+      <w:r>
+        <w:t xml:space="preserve"> quizzes e </w:t>
+      </w:r>
+      <w:proofErr w:type="spellStart"/>
+      <w:r>
+        <w:t>receber</w:t>
+      </w:r>
+      <w:proofErr w:type="spellEnd"/>
+      <w:r>
+        <w:t xml:space="preserve"> </w:t>
+      </w:r>
+      <w:proofErr w:type="spellStart"/>
+      <w:r>
+        <w:t>dicas</w:t>
+      </w:r>
+      <w:proofErr w:type="spellEnd"/>
+      <w:r>
+        <w:t xml:space="preserve"> </w:t>
+      </w:r>
+      <w:proofErr w:type="spellStart"/>
+      <w:r>
+        <w:t>diárias</w:t>
+      </w:r>
+      <w:proofErr w:type="spellEnd"/>
+      <w:r>
+        <w:t xml:space="preserve"> </w:t>
+      </w:r>
+      <w:proofErr w:type="spellStart"/>
+      <w:r>
+        <w:t>contextualizadas</w:t>
+      </w:r>
+      <w:proofErr w:type="spellEnd"/>
+      <w:r>
+        <w:t xml:space="preserve"> para </w:t>
+      </w:r>
+      <w:proofErr w:type="spellStart"/>
+      <w:r>
+        <w:t>aprender</w:t>
+      </w:r>
+      <w:proofErr w:type="spellEnd"/>
+      <w:r>
+        <w:t xml:space="preserve"> </w:t>
+      </w:r>
+      <w:proofErr w:type="spellStart"/>
+      <w:r>
+        <w:t>mais</w:t>
+      </w:r>
+      <w:proofErr w:type="spellEnd"/>
+      <w:r>
+        <w:t xml:space="preserve"> um </w:t>
+      </w:r>
+      <w:proofErr w:type="spellStart"/>
+      <w:r>
+        <w:t>sobre</w:t>
+      </w:r>
+      <w:proofErr w:type="spellEnd"/>
+      <w:r>
+        <w:t xml:space="preserve"> o outro de forma </w:t>
+      </w:r>
+      <w:proofErr w:type="spellStart"/>
+      <w:r>
+        <w:t>leve</w:t>
+      </w:r>
+      <w:proofErr w:type="spellEnd"/>
+      <w:r>
+        <w:t xml:space="preserve"> e </w:t>
+      </w:r>
+      <w:proofErr w:type="spellStart"/>
+      <w:r>
+        <w:t>divertida</w:t>
+      </w:r>
+      <w:proofErr w:type="spellEnd"/>
+      <w:r>
+        <w:t>.</w:t>
+      </w:r>
+    </w:p>
+    <w:p>
+      <w:pPr>
+        <w:jc w:val="both"/>
+      </w:pPr>
+    </w:p>
+    <w:p>
+      <w:pPr>
+        <w:jc w:val="both"/>
+      </w:pPr>
+      <w:r>
+        <w:t xml:space="preserve">HU-08 — Como </w:t>
+      </w:r>
+      <w:proofErr w:type="spellStart"/>
+      <w:r>
+        <w:t>usuário</w:t>
+      </w:r>
+      <w:proofErr w:type="spellEnd"/>
+      <w:r>
+        <w:t xml:space="preserve">, </w:t>
+      </w:r>
+      <w:proofErr w:type="spellStart"/>
+      <w:r>
+        <w:t>quero</w:t>
+      </w:r>
+      <w:proofErr w:type="spellEnd"/>
+      <w:r>
+        <w:t xml:space="preserve"> registrar </w:t>
+      </w:r>
+      <w:proofErr w:type="spellStart"/>
+      <w:r>
+        <w:t>informações</w:t>
+      </w:r>
+      <w:proofErr w:type="spellEnd"/>
+      <w:r>
+        <w:t xml:space="preserve"> de </w:t>
+      </w:r>
+      <w:proofErr w:type="spellStart"/>
+      <w:r>
+        <w:t>saúde</w:t>
+      </w:r>
+      <w:proofErr w:type="spellEnd"/>
+      <w:r>
+        <w:t xml:space="preserve"> e </w:t>
+      </w:r>
+      <w:proofErr w:type="spellStart"/>
+      <w:r>
+        <w:t>bem-estar</w:t>
+      </w:r>
+      <w:proofErr w:type="spellEnd"/>
+      <w:r>
+        <w:t xml:space="preserve"> — </w:t>
+      </w:r>
+      <w:proofErr w:type="spellStart"/>
+      <w:r>
+        <w:t>como</w:t>
+      </w:r>
+      <w:proofErr w:type="spellEnd"/>
+      <w:r>
+        <w:t xml:space="preserve"> </w:t>
+      </w:r>
+      <w:proofErr w:type="spellStart"/>
+      <w:r>
+        <w:t>ciclo</w:t>
+      </w:r>
+      <w:proofErr w:type="spellEnd"/>
+      <w:r>
+        <w:t xml:space="preserve"> menstrual e dados do pet real — para </w:t>
+      </w:r>
+      <w:proofErr w:type="spellStart"/>
+      <w:r>
+        <w:t>centralizar</w:t>
+      </w:r>
+      <w:proofErr w:type="spellEnd"/>
+      <w:r>
+        <w:t xml:space="preserve"> esses </w:t>
+      </w:r>
+      <w:proofErr w:type="spellStart"/>
+      <w:r>
+        <w:t>cuidados</w:t>
+      </w:r>
+      <w:proofErr w:type="spellEnd"/>
+      <w:r>
+        <w:t xml:space="preserve"> </w:t>
+      </w:r>
+      <w:proofErr w:type="spellStart"/>
+      <w:r>
+        <w:t>dentro</w:t>
+      </w:r>
+      <w:proofErr w:type="spellEnd"/>
+      <w:r>
+        <w:t xml:space="preserve"> do app do </w:t>
+      </w:r>
+      <w:proofErr w:type="spellStart"/>
+      <w:r>
+        <w:t>casal</w:t>
+      </w:r>
+      <w:proofErr w:type="spellEnd"/>
+      <w:r>
+        <w:t>.</w:t>
+      </w:r>
+    </w:p>
+    <w:p>
+      <w:pPr>
+        <w:jc w:val="both"/>
+      </w:pPr>
+    </w:p>
+    <w:p>
+      <w:pPr>
+        <w:jc w:val="both"/>
+      </w:pPr>
+      <w:r>
+        <w:rPr>
+          <w:noProof/>
+        </w:rPr>
+        <w:lastRenderedPageBreak/>
+        <w:drawing>
+          <wp:inline distT="0" distB="0" distL="0" distR="0" wp14:anchorId="6D187959" wp14:editId="3A2182BD">
+            <wp:extent cx="3200400" cy="8220075"/>
+            <wp:effectExtent l="0" t="0" r="0" b="9525"/>
+            <wp:docPr id="2" name="Imagem 2"/>
+            <wp:cNvGraphicFramePr>
+              <a:graphicFrameLocks xmlns:a="http://schemas.openxmlformats.org/drawingml/2006/main" noChangeAspect="1"/>
+            </wp:cNvGraphicFramePr>
+            <a:graphic xmlns:a="http://schemas.openxmlformats.org/drawingml/2006/main">
+              <a:graphicData uri="http://schemas.openxmlformats.org/drawingml/2006/picture">
+                <pic:pic xmlns:pic="http://schemas.openxmlformats.org/drawingml/2006/picture">
+                  <pic:nvPicPr>
+                    <pic:cNvPr id="0" name="Picture 2"/>
+                    <pic:cNvPicPr>
+                      <a:picLocks noChangeAspect="1" noChangeArrowheads="1"/>
+                    </pic:cNvPicPr>
+                  </pic:nvPicPr>
+                  <pic:blipFill>
+                    <a:blip r:embed="rId12">
+                      <a:extLst>
+                        <a:ext uri="{28A0092B-C50C-407E-A947-70E740481C1C}">
+                          <a14:useLocalDpi xmlns:a14="http://schemas.microsoft.com/office/drawing/2010/main" val="0"/>
+                        </a:ext>
+                      </a:extLst>
+                    </a:blip>
+                    <a:srcRect/>
+                    <a:stretch>
+                      <a:fillRect/>
+                    </a:stretch>
+                  </pic:blipFill>
+                  <pic:spPr bwMode="auto">
+                    <a:xfrm>
+                      <a:off x="0" y="0"/>
+                      <a:ext cx="3200400" cy="8220075"/>
+                    </a:xfrm>
+                    <a:prstGeom prst="rect">
+                      <a:avLst/>
+                    </a:prstGeom>
+                    <a:noFill/>
+                    <a:ln>
+                      <a:noFill/>
+                    </a:ln>
+                  </pic:spPr>
+                </pic:pic>
+              </a:graphicData>
+            </a:graphic>
+          </wp:inline>
+        </w:drawing>
       </w:r>
     </w:p>
     <w:p>
@@ -1653,150 +3815,11 @@
         </w:numPr>
         <w:jc w:val="both"/>
       </w:pPr>
-      <w:bookmarkStart w:id="6" w:name="_2et92p0" w:colFirst="0" w:colLast="0"/>
-      <w:bookmarkEnd w:id="6"/>
-      <w:proofErr w:type="spellStart"/>
-      <w:r>
-        <w:t>Modelo</w:t>
-      </w:r>
-      <w:proofErr w:type="spellEnd"/>
-      <w:r>
-        <w:t xml:space="preserve"> de Casos de </w:t>
-      </w:r>
-      <w:proofErr w:type="spellStart"/>
-      <w:r>
-        <w:t>Uso</w:t>
-      </w:r>
-      <w:proofErr w:type="spellEnd"/>
-      <w:r>
-        <w:t xml:space="preserve"> </w:t>
-      </w:r>
-    </w:p>
-    <w:p>
-      <w:pPr>
-        <w:jc w:val="both"/>
-      </w:pPr>
-      <w:r>
-        <w:t xml:space="preserve">Nesta </w:t>
-      </w:r>
-      <w:proofErr w:type="spellStart"/>
-      <w:r>
-        <w:t>subseção</w:t>
-      </w:r>
-      <w:proofErr w:type="spellEnd"/>
-      <w:r>
-        <w:t xml:space="preserve"> é </w:t>
-      </w:r>
-      <w:proofErr w:type="spellStart"/>
-      <w:r>
-        <w:t>apresentado</w:t>
-      </w:r>
-      <w:proofErr w:type="spellEnd"/>
-      <w:r>
-        <w:t xml:space="preserve"> o </w:t>
-      </w:r>
-      <w:proofErr w:type="spellStart"/>
-      <w:r>
-        <w:t>diagrama</w:t>
-      </w:r>
-      <w:proofErr w:type="spellEnd"/>
-      <w:r>
-        <w:t xml:space="preserve"> de </w:t>
-      </w:r>
-      <w:proofErr w:type="spellStart"/>
-      <w:r>
-        <w:t>casos</w:t>
-      </w:r>
-      <w:proofErr w:type="spellEnd"/>
-      <w:r>
-        <w:t xml:space="preserve"> de </w:t>
-      </w:r>
-      <w:proofErr w:type="spellStart"/>
-      <w:r>
-        <w:t>uso</w:t>
-      </w:r>
-      <w:proofErr w:type="spellEnd"/>
-      <w:r>
-        <w:t xml:space="preserve"> do </w:t>
-      </w:r>
-      <w:proofErr w:type="spellStart"/>
-      <w:r>
-        <w:t>sistema</w:t>
-      </w:r>
-      <w:proofErr w:type="spellEnd"/>
-      <w:r>
-        <w:t xml:space="preserve">. Para </w:t>
-      </w:r>
-      <w:proofErr w:type="spellStart"/>
-      <w:r>
-        <w:t>cada</w:t>
-      </w:r>
-      <w:proofErr w:type="spellEnd"/>
-      <w:r>
-        <w:t xml:space="preserve"> um deles, utilize um ID que </w:t>
-      </w:r>
-      <w:proofErr w:type="spellStart"/>
-      <w:r>
-        <w:t>possa</w:t>
-      </w:r>
-      <w:proofErr w:type="spellEnd"/>
-      <w:r>
-        <w:t xml:space="preserve"> </w:t>
-      </w:r>
-      <w:proofErr w:type="spellStart"/>
-      <w:r>
-        <w:t>servir</w:t>
-      </w:r>
-      <w:proofErr w:type="spellEnd"/>
-      <w:r>
-        <w:t xml:space="preserve"> de </w:t>
-      </w:r>
-      <w:proofErr w:type="spellStart"/>
-      <w:r>
-        <w:t>referência</w:t>
-      </w:r>
-      <w:proofErr w:type="spellEnd"/>
-      <w:r>
-        <w:t xml:space="preserve"> no restante do </w:t>
-      </w:r>
-      <w:proofErr w:type="spellStart"/>
-      <w:r>
-        <w:t>documento</w:t>
-      </w:r>
-      <w:proofErr w:type="spellEnd"/>
-      <w:r>
-        <w:t xml:space="preserve">. Por </w:t>
-      </w:r>
-      <w:proofErr w:type="spellStart"/>
-      <w:r>
-        <w:t>exemplo</w:t>
-      </w:r>
-      <w:proofErr w:type="spellEnd"/>
-      <w:r>
-        <w:t xml:space="preserve"> UC-01 para o Caso de </w:t>
-      </w:r>
-      <w:proofErr w:type="spellStart"/>
-      <w:r>
-        <w:t>Uso</w:t>
-      </w:r>
-      <w:proofErr w:type="spellEnd"/>
-      <w:r>
-        <w:t xml:space="preserve"> 01.</w:t>
-      </w:r>
-    </w:p>
-    <w:p>
-      <w:pPr>
-        <w:pStyle w:val="Ttulo2"/>
-        <w:numPr>
-          <w:ilvl w:val="1"/>
-          <w:numId w:val="1"/>
-        </w:numPr>
-        <w:jc w:val="both"/>
-      </w:pPr>
       <w:bookmarkStart w:id="7" w:name="_ns02tpezvsrt" w:colFirst="0" w:colLast="0"/>
       <w:bookmarkEnd w:id="7"/>
       <w:proofErr w:type="spellStart"/>
       <w:r>
+        <w:lastRenderedPageBreak/>
         <w:t>Diagrama</w:t>
       </w:r>
       <w:proofErr w:type="spellEnd"/>
@@ -3039,6 +5062,7 @@
       <w:bookmarkEnd w:id="15"/>
       <w:proofErr w:type="spellStart"/>
       <w:r>
+        <w:lastRenderedPageBreak/>
         <w:t>Modelos</w:t>
       </w:r>
       <w:proofErr w:type="spellEnd"/>
@@ -3225,7 +5249,7 @@
       </w:r>
     </w:p>
     <w:sectPr>
-      <w:headerReference w:type="default" r:id="rId11"/>
+      <w:headerReference w:type="default" r:id="rId13"/>
       <w:pgSz w:w="12240" w:h="15840"/>
       <w:pgMar w:top="1440" w:right="1296" w:bottom="1440" w:left="1296" w:header="720" w:footer="720" w:gutter="0"/>
       <w:pgNumType w:start="1"/>
@@ -3748,7 +5772,29 @@
         <w:sz w:val="20"/>
         <w:szCs w:val="20"/>
       </w:rPr>
-      <w:t xml:space="preserve">&gt; Página </w:t>
+      <w:t xml:space="preserve">&gt; </w:t>
+    </w:r>
+    <w:proofErr w:type="spellStart"/>
+    <w:r>
+      <w:rPr>
+        <w:b/>
+        <w:i/>
+        <w:color w:val="000000"/>
+        <w:sz w:val="20"/>
+        <w:szCs w:val="20"/>
+      </w:rPr>
+      <w:t>Página</w:t>
+    </w:r>
+    <w:proofErr w:type="spellEnd"/>
+    <w:r>
+      <w:rPr>
+        <w:b/>
+        <w:i/>
+        <w:color w:val="000000"/>
+        <w:sz w:val="20"/>
+        <w:szCs w:val="20"/>
+      </w:rPr>
+      <w:t xml:space="preserve"> </w:t>
     </w:r>
     <w:r>
       <w:rPr>
@@ -4333,6 +6379,7 @@
   <w:style w:type="paragraph" w:default="1" w:styleId="Normal">
     <w:name w:val="Normal"/>
     <w:qFormat/>
+    <w:rsid w:val="00ED2B94"/>
   </w:style>
   <w:style w:type="paragraph" w:styleId="Ttulo1">
     <w:name w:val="heading 1"/>
@@ -4528,9 +6575,7 @@
       <w:tblStyleRowBandSize w:val="1"/>
       <w:tblStyleColBandSize w:val="1"/>
       <w:tblCellMar>
-        <w:top w:w="0" w:type="dxa"/>
         <w:left w:w="115" w:type="dxa"/>
-        <w:bottom w:w="0" w:type="dxa"/>
         <w:right w:w="115" w:type="dxa"/>
       </w:tblCellMar>
     </w:tblPr>
@@ -4541,9 +6586,7 @@
       <w:tblStyleRowBandSize w:val="1"/>
       <w:tblStyleColBandSize w:val="1"/>
       <w:tblCellMar>
-        <w:top w:w="0" w:type="dxa"/>
         <w:left w:w="115" w:type="dxa"/>
-        <w:bottom w:w="0" w:type="dxa"/>
         <w:right w:w="115" w:type="dxa"/>
       </w:tblCellMar>
     </w:tblPr>
@@ -4554,9 +6597,7 @@
       <w:tblStyleRowBandSize w:val="1"/>
       <w:tblStyleColBandSize w:val="1"/>
       <w:tblCellMar>
-        <w:top w:w="0" w:type="dxa"/>
         <w:left w:w="115" w:type="dxa"/>
-        <w:bottom w:w="0" w:type="dxa"/>
         <w:right w:w="115" w:type="dxa"/>
       </w:tblCellMar>
     </w:tblPr>

</xml_diff>

<commit_message>
docs: diagrama de implantacao
</commit_message>
<xml_diff>
--- a/docs/LifeDuo - Documentação de Projeto.docx
+++ b/docs/LifeDuo - Documentação de Projeto.docx
@@ -6185,239 +6185,61 @@
           <w:szCs w:val="22"/>
         </w:rPr>
       </w:pPr>
-      <w:proofErr w:type="spellStart"/>
       <w:r>
         <w:rPr>
           <w:rFonts w:ascii="Times New Roman" w:eastAsia="Times New Roman" w:hAnsi="Times New Roman" w:cs="Times New Roman"/>
+          <w:noProof/>
           <w:sz w:val="22"/>
           <w:szCs w:val="22"/>
         </w:rPr>
-        <w:t>Diagramas</w:t>
-      </w:r>
-      <w:proofErr w:type="spellEnd"/>
-      <w:r>
-        <w:rPr>
-          <w:rFonts w:ascii="Times New Roman" w:eastAsia="Times New Roman" w:hAnsi="Times New Roman" w:cs="Times New Roman"/>
-          <w:sz w:val="22"/>
-          <w:szCs w:val="22"/>
-        </w:rPr>
-        <w:t xml:space="preserve"> de </w:t>
-      </w:r>
-      <w:proofErr w:type="spellStart"/>
-      <w:r>
-        <w:rPr>
-          <w:rFonts w:ascii="Times New Roman" w:eastAsia="Times New Roman" w:hAnsi="Times New Roman" w:cs="Times New Roman"/>
-          <w:sz w:val="22"/>
-          <w:szCs w:val="22"/>
-        </w:rPr>
-        <w:t>componentes</w:t>
-      </w:r>
-      <w:proofErr w:type="spellEnd"/>
-      <w:r>
-        <w:rPr>
-          <w:rFonts w:ascii="Times New Roman" w:eastAsia="Times New Roman" w:hAnsi="Times New Roman" w:cs="Times New Roman"/>
-          <w:sz w:val="22"/>
-          <w:szCs w:val="22"/>
-        </w:rPr>
-        <w:t xml:space="preserve"> do </w:t>
-      </w:r>
-      <w:proofErr w:type="spellStart"/>
-      <w:r>
-        <w:rPr>
-          <w:rFonts w:ascii="Times New Roman" w:eastAsia="Times New Roman" w:hAnsi="Times New Roman" w:cs="Times New Roman"/>
-          <w:sz w:val="22"/>
-          <w:szCs w:val="22"/>
-        </w:rPr>
-        <w:t>sistema</w:t>
-      </w:r>
-      <w:proofErr w:type="spellEnd"/>
-      <w:r>
-        <w:rPr>
-          <w:rFonts w:ascii="Times New Roman" w:eastAsia="Times New Roman" w:hAnsi="Times New Roman" w:cs="Times New Roman"/>
-          <w:sz w:val="22"/>
-          <w:szCs w:val="22"/>
-        </w:rPr>
-        <w:t xml:space="preserve">. </w:t>
-      </w:r>
-      <w:proofErr w:type="spellStart"/>
-      <w:r>
-        <w:rPr>
-          <w:rFonts w:ascii="Times New Roman" w:eastAsia="Times New Roman" w:hAnsi="Times New Roman" w:cs="Times New Roman"/>
-          <w:sz w:val="22"/>
-          <w:szCs w:val="22"/>
-        </w:rPr>
-        <w:t>Diagrama</w:t>
-      </w:r>
-      <w:proofErr w:type="spellEnd"/>
-      <w:r>
-        <w:rPr>
-          <w:rFonts w:ascii="Times New Roman" w:eastAsia="Times New Roman" w:hAnsi="Times New Roman" w:cs="Times New Roman"/>
-          <w:sz w:val="22"/>
-          <w:szCs w:val="22"/>
-        </w:rPr>
-        <w:t xml:space="preserve"> de </w:t>
-      </w:r>
-      <w:proofErr w:type="spellStart"/>
-      <w:r>
-        <w:rPr>
-          <w:rFonts w:ascii="Times New Roman" w:eastAsia="Times New Roman" w:hAnsi="Times New Roman" w:cs="Times New Roman"/>
-          <w:sz w:val="22"/>
-          <w:szCs w:val="22"/>
-        </w:rPr>
-        <w:t>implantação</w:t>
-      </w:r>
-      <w:proofErr w:type="spellEnd"/>
-      <w:r>
-        <w:rPr>
-          <w:rFonts w:ascii="Times New Roman" w:eastAsia="Times New Roman" w:hAnsi="Times New Roman" w:cs="Times New Roman"/>
-          <w:sz w:val="22"/>
-          <w:szCs w:val="22"/>
-        </w:rPr>
-        <w:t xml:space="preserve"> </w:t>
-      </w:r>
-      <w:proofErr w:type="spellStart"/>
-      <w:r>
-        <w:rPr>
-          <w:rFonts w:ascii="Times New Roman" w:eastAsia="Times New Roman" w:hAnsi="Times New Roman" w:cs="Times New Roman"/>
-          <w:sz w:val="22"/>
-          <w:szCs w:val="22"/>
-        </w:rPr>
-        <w:t>mostrando</w:t>
-      </w:r>
-      <w:proofErr w:type="spellEnd"/>
-      <w:r>
-        <w:rPr>
-          <w:rFonts w:ascii="Times New Roman" w:eastAsia="Times New Roman" w:hAnsi="Times New Roman" w:cs="Times New Roman"/>
-          <w:sz w:val="22"/>
-          <w:szCs w:val="22"/>
-        </w:rPr>
-        <w:t xml:space="preserve"> </w:t>
-      </w:r>
-      <w:proofErr w:type="spellStart"/>
-      <w:r>
-        <w:rPr>
-          <w:rFonts w:ascii="Times New Roman" w:eastAsia="Times New Roman" w:hAnsi="Times New Roman" w:cs="Times New Roman"/>
-          <w:sz w:val="22"/>
-          <w:szCs w:val="22"/>
-        </w:rPr>
-        <w:t>onde</w:t>
-      </w:r>
-      <w:proofErr w:type="spellEnd"/>
-      <w:r>
-        <w:rPr>
-          <w:rFonts w:ascii="Times New Roman" w:eastAsia="Times New Roman" w:hAnsi="Times New Roman" w:cs="Times New Roman"/>
-          <w:sz w:val="22"/>
-          <w:szCs w:val="22"/>
-        </w:rPr>
-        <w:t xml:space="preserve"> </w:t>
-      </w:r>
-      <w:proofErr w:type="spellStart"/>
-      <w:r>
-        <w:rPr>
-          <w:rFonts w:ascii="Times New Roman" w:eastAsia="Times New Roman" w:hAnsi="Times New Roman" w:cs="Times New Roman"/>
-          <w:sz w:val="22"/>
-          <w:szCs w:val="22"/>
-        </w:rPr>
-        <w:t>os</w:t>
-      </w:r>
-      <w:proofErr w:type="spellEnd"/>
-      <w:r>
-        <w:rPr>
-          <w:rFonts w:ascii="Times New Roman" w:eastAsia="Times New Roman" w:hAnsi="Times New Roman" w:cs="Times New Roman"/>
-          <w:sz w:val="22"/>
-          <w:szCs w:val="22"/>
-        </w:rPr>
-        <w:t xml:space="preserve"> </w:t>
-      </w:r>
-      <w:proofErr w:type="spellStart"/>
-      <w:r>
-        <w:rPr>
-          <w:rFonts w:ascii="Times New Roman" w:eastAsia="Times New Roman" w:hAnsi="Times New Roman" w:cs="Times New Roman"/>
-          <w:sz w:val="22"/>
-          <w:szCs w:val="22"/>
-        </w:rPr>
-        <w:t>componentes</w:t>
-      </w:r>
-      <w:proofErr w:type="spellEnd"/>
-      <w:r>
-        <w:rPr>
-          <w:rFonts w:ascii="Times New Roman" w:eastAsia="Times New Roman" w:hAnsi="Times New Roman" w:cs="Times New Roman"/>
-          <w:sz w:val="22"/>
-          <w:szCs w:val="22"/>
-        </w:rPr>
-        <w:t xml:space="preserve"> </w:t>
-      </w:r>
-      <w:proofErr w:type="spellStart"/>
-      <w:r>
-        <w:rPr>
-          <w:rFonts w:ascii="Times New Roman" w:eastAsia="Times New Roman" w:hAnsi="Times New Roman" w:cs="Times New Roman"/>
-          <w:sz w:val="22"/>
-          <w:szCs w:val="22"/>
-        </w:rPr>
-        <w:t>estarão</w:t>
-      </w:r>
-      <w:proofErr w:type="spellEnd"/>
-      <w:r>
-        <w:rPr>
-          <w:rFonts w:ascii="Times New Roman" w:eastAsia="Times New Roman" w:hAnsi="Times New Roman" w:cs="Times New Roman"/>
-          <w:sz w:val="22"/>
-          <w:szCs w:val="22"/>
-        </w:rPr>
-        <w:t xml:space="preserve"> </w:t>
-      </w:r>
-      <w:proofErr w:type="spellStart"/>
-      <w:r>
-        <w:rPr>
-          <w:rFonts w:ascii="Times New Roman" w:eastAsia="Times New Roman" w:hAnsi="Times New Roman" w:cs="Times New Roman"/>
-          <w:sz w:val="22"/>
-          <w:szCs w:val="22"/>
-        </w:rPr>
-        <w:t>alocados</w:t>
-      </w:r>
-      <w:proofErr w:type="spellEnd"/>
-      <w:r>
-        <w:rPr>
-          <w:rFonts w:ascii="Times New Roman" w:eastAsia="Times New Roman" w:hAnsi="Times New Roman" w:cs="Times New Roman"/>
-          <w:sz w:val="22"/>
-          <w:szCs w:val="22"/>
-        </w:rPr>
-        <w:t xml:space="preserve"> para </w:t>
-      </w:r>
-      <w:proofErr w:type="gramStart"/>
-      <w:r>
-        <w:rPr>
-          <w:rFonts w:ascii="Times New Roman" w:eastAsia="Times New Roman" w:hAnsi="Times New Roman" w:cs="Times New Roman"/>
-          <w:sz w:val="22"/>
-          <w:szCs w:val="22"/>
-        </w:rPr>
-        <w:t>a</w:t>
-      </w:r>
-      <w:proofErr w:type="gramEnd"/>
-      <w:r>
-        <w:rPr>
-          <w:rFonts w:ascii="Times New Roman" w:eastAsia="Times New Roman" w:hAnsi="Times New Roman" w:cs="Times New Roman"/>
-          <w:sz w:val="22"/>
-          <w:szCs w:val="22"/>
-        </w:rPr>
-        <w:t xml:space="preserve"> </w:t>
-      </w:r>
-      <w:proofErr w:type="spellStart"/>
-      <w:r>
-        <w:rPr>
-          <w:rFonts w:ascii="Times New Roman" w:eastAsia="Times New Roman" w:hAnsi="Times New Roman" w:cs="Times New Roman"/>
-          <w:sz w:val="22"/>
-          <w:szCs w:val="22"/>
-        </w:rPr>
-        <w:t>execução</w:t>
-      </w:r>
-      <w:proofErr w:type="spellEnd"/>
-      <w:r>
-        <w:rPr>
-          <w:rFonts w:ascii="Times New Roman" w:eastAsia="Times New Roman" w:hAnsi="Times New Roman" w:cs="Times New Roman"/>
-          <w:sz w:val="22"/>
-          <w:szCs w:val="22"/>
-        </w:rPr>
-        <w:t>.</w:t>
+        <w:drawing>
+          <wp:inline distT="0" distB="0" distL="0" distR="0" wp14:anchorId="29F33495" wp14:editId="18EE36BB">
+            <wp:extent cx="6107430" cy="3390265"/>
+            <wp:effectExtent l="0" t="0" r="7620" b="635"/>
+            <wp:docPr id="2" name="Imagem 2"/>
+            <wp:cNvGraphicFramePr>
+              <a:graphicFrameLocks xmlns:a="http://schemas.openxmlformats.org/drawingml/2006/main" noChangeAspect="1"/>
+            </wp:cNvGraphicFramePr>
+            <a:graphic xmlns:a="http://schemas.openxmlformats.org/drawingml/2006/main">
+              <a:graphicData uri="http://schemas.openxmlformats.org/drawingml/2006/picture">
+                <pic:pic xmlns:pic="http://schemas.openxmlformats.org/drawingml/2006/picture">
+                  <pic:nvPicPr>
+                    <pic:cNvPr id="0" name="Picture 1"/>
+                    <pic:cNvPicPr>
+                      <a:picLocks noChangeAspect="1" noChangeArrowheads="1"/>
+                    </pic:cNvPicPr>
+                  </pic:nvPicPr>
+                  <pic:blipFill>
+                    <a:blip r:embed="rId17" cstate="print">
+                      <a:extLst>
+                        <a:ext uri="{28A0092B-C50C-407E-A947-70E740481C1C}">
+                          <a14:useLocalDpi xmlns:a14="http://schemas.microsoft.com/office/drawing/2010/main" val="0"/>
+                        </a:ext>
+                      </a:extLst>
+                    </a:blip>
+                    <a:srcRect/>
+                    <a:stretch>
+                      <a:fillRect/>
+                    </a:stretch>
+                  </pic:blipFill>
+                  <pic:spPr bwMode="auto">
+                    <a:xfrm>
+                      <a:off x="0" y="0"/>
+                      <a:ext cx="6107430" cy="3390265"/>
+                    </a:xfrm>
+                    <a:prstGeom prst="rect">
+                      <a:avLst/>
+                    </a:prstGeom>
+                    <a:noFill/>
+                    <a:ln>
+                      <a:noFill/>
+                    </a:ln>
+                  </pic:spPr>
+                </pic:pic>
+              </a:graphicData>
+            </a:graphic>
+          </wp:inline>
+        </w:drawing>
       </w:r>
     </w:p>
     <w:p>
@@ -6850,6 +6672,7 @@
       <w:bookmarkEnd w:id="14"/>
       <w:proofErr w:type="spellStart"/>
       <w:r>
+        <w:lastRenderedPageBreak/>
         <w:t>Modelos</w:t>
       </w:r>
       <w:proofErr w:type="spellEnd"/>
@@ -7036,7 +6859,7 @@
       </w:r>
     </w:p>
     <w:sectPr>
-      <w:headerReference w:type="default" r:id="rId17"/>
+      <w:headerReference w:type="default" r:id="rId18"/>
       <w:pgSz w:w="12240" w:h="15840"/>
       <w:pgMar w:top="1440" w:right="1296" w:bottom="1440" w:left="1296" w:header="720" w:footer="720" w:gutter="0"/>
       <w:pgNumType w:start="1"/>

</xml_diff>